<commit_message>
(docs) Ground the test case examples in the Mosul OpenMRS 3 configuration
- Use EMR role names (workbook name in brackets) instead of workbook-only
  roles; drop MedCo, which has no EMR role
- Show two real differences between the privileges matrix and the EMR:
  Clinical diagnosis is no longer locked by "Edit sensitive mental health
  fields" in F31 (it was in F03), and Mental Health Counselor can add
  orders while the matrix says no lab orders
- Use Mosul mental health cases (F31, PHQ-9, per-counselor appointment
  services, DHIS2 sync of F35) and OpenMRS 3 terms
- Reword the weight example: OpenMRS 3 forms refuse out-of-range values,
  they do not show soft warnings
- Align the workbook template's examples with the document

Co-Authored-By: Claude Opus 5.5 <noreply@anthropic.com>
Claude-Session: https://claude.ai/code/session_01U6uYJ2YYNCsnP72DpH3o5o
</commit_message>
<xml_diff>
--- a/docs/testing/metadonnees/LIME_EMR_Test_case_examples.docx
+++ b/docs/testing/metadonnees/LIME_EMR_Test_case_examples.docx
@@ -735,7 +735,7 @@
           <w:sz w:val="20"/>
           <w:szCs w:val="20"/>
         </w:rPr>
-        <w:t xml:space="preserve">For what the columns cannot express (a calculation, a plausibility check, a button), write one line per test in the existing Comments column of the form tab: Test: what I do -&gt; what I should see.</w:t>
+        <w:t xml:space="preserve">For what the columns cannot express (a calculation, a button, a missing limit), write one line per test in the existing Comments column of the form tab: Test: what I do -&gt; what I should see.</w:t>
       </w:r>
     </w:p>
     <w:tbl>
@@ -874,7 +874,7 @@
                 <w:sz w:val="20"/>
                 <w:szCs w:val="20"/>
               </w:rPr>
-              <w:t xml:space="preserve">F17, Weight at admission (in kg)</w:t>
+              <w:t xml:space="preserve">F35, PHQ-9 score</w:t>
             </w:r>
           </w:p>
         </w:tc>
@@ -912,7 +912,7 @@
                 <w:sz w:val="20"/>
                 <w:szCs w:val="20"/>
               </w:rPr>
-              <w:t xml:space="preserve">Test: Enter 450 -&gt; A warning: the weight is not plausible</w:t>
+              <w:t xml:space="preserve">Test: Answer « Nearly every day (3 points) » to the 9 questions -&gt; PHQ-9 score = 27</w:t>
             </w:r>
           </w:p>
         </w:tc>
@@ -1036,7 +1036,7 @@
                 <w:sz w:val="20"/>
                 <w:szCs w:val="20"/>
               </w:rPr>
-              <w:t xml:space="preserve">F35, PHQ-9 score</w:t>
+              <w:t xml:space="preserve">F17, Weight at admission (in kg)</w:t>
             </w:r>
           </w:p>
         </w:tc>
@@ -1074,12 +1074,37 @@
                 <w:sz w:val="20"/>
                 <w:szCs w:val="20"/>
               </w:rPr>
-              <w:t xml:space="preserve">Test: Answer « Nearly every day (3 points) » to the 9 questions -&gt; PHQ-9 score = 27</w:t>
+              <w:t xml:space="preserve">Test: Enter 450 -&gt; The value is refused</w:t>
             </w:r>
           </w:p>
         </w:tc>
       </w:tr>
     </w:tbl>
+    <w:p>
+      <w:pPr>
+        <w:spacing w:after="60" w:before="0" w:lineRule="auto"/>
+      </w:pPr>
+    </w:p>
+    <w:p>
+      <w:pPr>
+        <w:widowControl/>
+        <w:spacing w:after="200" w:before="0" w:line="276" w:lineRule="auto"/>
+        <w:jc w:val="both"/>
+      </w:pPr>
+      <w:r>
+        <w:rPr>
+          <w:rFonts w:ascii="Calibri" w:cs="Calibri" w:eastAsia="Calibri" w:hAnsi="Calibri"/>
+          <w:b w:val="false"/>
+          <w:bCs w:val="false"/>
+          <w:i/>
+          <w:iCs/>
+          <w:color w:val="5F6D6A"/>
+          <w:sz w:val="20"/>
+          <w:szCs w:val="20"/>
+        </w:rPr>
+        <w:t xml:space="preserve">OpenMRS 3 forms refuse a value outside the Lower/Upper limit; they cannot show a soft warning. The weight test therefore also asks for an Upper limit, which F17 does not have today.</w:t>
+      </w:r>
+    </w:p>
     <w:p>
       <w:pPr>
         <w:keepNext/>
@@ -1119,7 +1144,7 @@
           <w:sz w:val="20"/>
           <w:szCs w:val="20"/>
         </w:rPr>
-        <w:t xml:space="preserve">Patient journeys, user privileges, registration, appointments, DHIS2 and reports go in the existing User flow template tab, one step per row. Step starts with a short code; Action is what I do; Description is what I should see.</w:t>
+        <w:t xml:space="preserve">Patient journeys, user privileges and confidentiality, appointments, registration and DHIS2 go in the existing User flow template tab, one step per row. Step starts with a short code; Action is what I do; Description is what I should see. User is the EMR role (workbook role name in brackets). ROLES-2 and ROLES-3 come from the User roles and privileges tab and show two differences to review together.</w:t>
       </w:r>
     </w:p>
     <w:tbl>
@@ -1135,10 +1160,11 @@
         </w:tblBorders>
       </w:tblPr>
       <w:tblGrid>
-        <w:gridCol w:w="1100"/>
-        <w:gridCol w:w="3060"/>
-        <w:gridCol w:w="3500"/>
-        <w:gridCol w:w="1700"/>
+        <w:gridCol w:w="1040"/>
+        <w:gridCol w:w="2300"/>
+        <w:gridCol w:w="2700"/>
+        <w:gridCol w:w="1720"/>
+        <w:gridCol w:w="1600"/>
       </w:tblGrid>
       <w:tr>
         <w:trPr>
@@ -1147,7 +1173,7 @@
         </w:trPr>
         <w:tc>
           <w:tcPr>
-            <w:tcW w:type="dxa" w:w="1100"/>
+            <w:tcW w:type="dxa" w:w="1040"/>
             <w:tcBorders>
               <w:top w:val="single" w:color="BFBFBF" w:sz="2"/>
               <w:left w:val="single" w:color="BFBFBF" w:sz="2"/>
@@ -1185,7 +1211,7 @@
         </w:tc>
         <w:tc>
           <w:tcPr>
-            <w:tcW w:type="dxa" w:w="3060"/>
+            <w:tcW w:type="dxa" w:w="2300"/>
             <w:tcBorders>
               <w:top w:val="single" w:color="BFBFBF" w:sz="2"/>
               <w:left w:val="single" w:color="BFBFBF" w:sz="2"/>
@@ -1223,7 +1249,7 @@
         </w:tc>
         <w:tc>
           <w:tcPr>
-            <w:tcW w:type="dxa" w:w="3500"/>
+            <w:tcW w:type="dxa" w:w="2700"/>
             <w:tcBorders>
               <w:top w:val="single" w:color="BFBFBF" w:sz="2"/>
               <w:left w:val="single" w:color="BFBFBF" w:sz="2"/>
@@ -1261,7 +1287,7 @@
         </w:tc>
         <w:tc>
           <w:tcPr>
-            <w:tcW w:type="dxa" w:w="1700"/>
+            <w:tcW w:type="dxa" w:w="1720"/>
             <w:tcBorders>
               <w:top w:val="single" w:color="BFBFBF" w:sz="2"/>
               <w:left w:val="single" w:color="BFBFBF" w:sz="2"/>
@@ -1294,6 +1320,44 @@
                 <w:szCs w:val="20"/>
               </w:rPr>
               <w:t xml:space="preserve">User</w:t>
+            </w:r>
+          </w:p>
+        </w:tc>
+        <w:tc>
+          <w:tcPr>
+            <w:tcW w:type="dxa" w:w="1600"/>
+            <w:tcBorders>
+              <w:top w:val="single" w:color="BFBFBF" w:sz="2"/>
+              <w:left w:val="single" w:color="BFBFBF" w:sz="2"/>
+              <w:bottom w:val="single" w:color="BFBFBF" w:sz="2"/>
+              <w:right w:val="single" w:color="BFBFBF" w:sz="2"/>
+            </w:tcBorders>
+            <w:shd w:fill="E7E6E6" w:color="auto" w:val="clear"/>
+            <w:tcMar>
+              <w:top w:type="dxa" w:w="80"/>
+              <w:left w:type="dxa" w:w="120"/>
+              <w:bottom w:type="dxa" w:w="80"/>
+              <w:right w:type="dxa" w:w="120"/>
+            </w:tcMar>
+            <w:vAlign w:val="center"/>
+          </w:tcPr>
+          <w:p>
+            <w:pPr>
+              <w:widowControl/>
+              <w:spacing w:after="0" w:before="0" w:lineRule="auto"/>
+            </w:pPr>
+            <w:r>
+              <w:rPr>
+                <w:rFonts w:ascii="Calibri" w:cs="Calibri" w:eastAsia="Calibri" w:hAnsi="Calibri"/>
+                <w:b/>
+                <w:bCs/>
+                <w:i w:val="false"/>
+                <w:iCs w:val="false"/>
+                <w:color w:val="000000"/>
+                <w:sz w:val="20"/>
+                <w:szCs w:val="20"/>
+              </w:rPr>
+              <w:t xml:space="preserve">Today</w:t>
             </w:r>
           </w:p>
         </w:tc>
@@ -1304,153 +1368,191 @@
         </w:trPr>
         <w:tc>
           <w:tcPr>
-            <w:tcW w:type="dxa" w:w="1100"/>
-            <w:tcBorders>
-              <w:top w:val="single" w:color="BFBFBF" w:sz="2"/>
-              <w:left w:val="single" w:color="BFBFBF" w:sz="2"/>
-              <w:bottom w:val="single" w:color="BFBFBF" w:sz="2"/>
-              <w:right w:val="single" w:color="BFBFBF" w:sz="2"/>
-            </w:tcBorders>
-            <w:shd w:fill="FFFFFF" w:color="auto" w:val="clear"/>
-            <w:tcMar>
-              <w:top w:type="dxa" w:w="80"/>
-              <w:left w:type="dxa" w:w="120"/>
-              <w:bottom w:type="dxa" w:w="80"/>
-              <w:right w:type="dxa" w:w="120"/>
-            </w:tcMar>
-            <w:vAlign w:val="center"/>
-          </w:tcPr>
-          <w:p>
-            <w:pPr>
-              <w:widowControl/>
-              <w:spacing w:after="0" w:before="0" w:lineRule="auto"/>
-            </w:pPr>
-            <w:r>
-              <w:rPr>
-                <w:rFonts w:ascii="Calibri" w:cs="Calibri" w:eastAsia="Calibri" w:hAnsi="Calibri"/>
-                <w:b w:val="false"/>
-                <w:bCs w:val="false"/>
-                <w:i w:val="false"/>
-                <w:iCs w:val="false"/>
-                <w:color w:val="000000"/>
-                <w:sz w:val="20"/>
-                <w:szCs w:val="20"/>
-              </w:rPr>
-              <w:t xml:space="preserve">F17-1</w:t>
-            </w:r>
-          </w:p>
-        </w:tc>
-        <w:tc>
-          <w:tcPr>
-            <w:tcW w:type="dxa" w:w="3060"/>
-            <w:tcBorders>
-              <w:top w:val="single" w:color="BFBFBF" w:sz="2"/>
-              <w:left w:val="single" w:color="BFBFBF" w:sz="2"/>
-              <w:bottom w:val="single" w:color="BFBFBF" w:sz="2"/>
-              <w:right w:val="single" w:color="BFBFBF" w:sz="2"/>
-            </w:tcBorders>
-            <w:shd w:fill="FFFFFF" w:color="auto" w:val="clear"/>
-            <w:tcMar>
-              <w:top w:type="dxa" w:w="80"/>
-              <w:left w:type="dxa" w:w="120"/>
-              <w:bottom w:type="dxa" w:w="80"/>
-              <w:right w:type="dxa" w:w="120"/>
-            </w:tcMar>
-            <w:vAlign w:val="center"/>
-          </w:tcPr>
-          <w:p>
-            <w:pPr>
-              <w:widowControl/>
-              <w:spacing w:after="0" w:before="0" w:lineRule="auto"/>
-            </w:pPr>
-            <w:r>
-              <w:rPr>
-                <w:rFonts w:ascii="Calibri" w:cs="Calibri" w:eastAsia="Calibri" w:hAnsi="Calibri"/>
-                <w:b w:val="false"/>
-                <w:bCs w:val="false"/>
-                <w:i w:val="false"/>
-                <w:iCs w:val="false"/>
-                <w:color w:val="000000"/>
-                <w:sz w:val="20"/>
-                <w:szCs w:val="20"/>
-              </w:rPr>
-              <w:t xml:space="preserve">Save a Surgery Admission form, then open the patient chart</w:t>
-            </w:r>
-          </w:p>
-        </w:tc>
-        <w:tc>
-          <w:tcPr>
-            <w:tcW w:type="dxa" w:w="3500"/>
-            <w:tcBorders>
-              <w:top w:val="single" w:color="BFBFBF" w:sz="2"/>
-              <w:left w:val="single" w:color="BFBFBF" w:sz="2"/>
-              <w:bottom w:val="single" w:color="BFBFBF" w:sz="2"/>
-              <w:right w:val="single" w:color="BFBFBF" w:sz="2"/>
-            </w:tcBorders>
-            <w:shd w:fill="FFFFFF" w:color="auto" w:val="clear"/>
-            <w:tcMar>
-              <w:top w:type="dxa" w:w="80"/>
-              <w:left w:type="dxa" w:w="120"/>
-              <w:bottom w:type="dxa" w:w="80"/>
-              <w:right w:type="dxa" w:w="120"/>
-            </w:tcMar>
-            <w:vAlign w:val="center"/>
-          </w:tcPr>
-          <w:p>
-            <w:pPr>
-              <w:widowControl/>
-              <w:spacing w:after="0" w:before="0" w:lineRule="auto"/>
-            </w:pPr>
-            <w:r>
-              <w:rPr>
-                <w:rFonts w:ascii="Calibri" w:cs="Calibri" w:eastAsia="Calibri" w:hAnsi="Calibri"/>
-                <w:b w:val="false"/>
-                <w:bCs w:val="false"/>
-                <w:i w:val="false"/>
-                <w:iCs w:val="false"/>
-                <w:color w:val="000000"/>
-                <w:sz w:val="20"/>
-                <w:szCs w:val="20"/>
-              </w:rPr>
-              <w:t xml:space="preserve">The admission appears in the visit with its admission date</w:t>
-            </w:r>
-          </w:p>
-        </w:tc>
-        <w:tc>
-          <w:tcPr>
-            <w:tcW w:type="dxa" w:w="1700"/>
-            <w:tcBorders>
-              <w:top w:val="single" w:color="BFBFBF" w:sz="2"/>
-              <w:left w:val="single" w:color="BFBFBF" w:sz="2"/>
-              <w:bottom w:val="single" w:color="BFBFBF" w:sz="2"/>
-              <w:right w:val="single" w:color="BFBFBF" w:sz="2"/>
-            </w:tcBorders>
-            <w:shd w:fill="FFFFFF" w:color="auto" w:val="clear"/>
-            <w:tcMar>
-              <w:top w:type="dxa" w:w="80"/>
-              <w:left w:type="dxa" w:w="120"/>
-              <w:bottom w:type="dxa" w:w="80"/>
-              <w:right w:type="dxa" w:w="120"/>
-            </w:tcMar>
-            <w:vAlign w:val="center"/>
-          </w:tcPr>
-          <w:p>
-            <w:pPr>
-              <w:widowControl/>
-              <w:spacing w:after="0" w:before="0" w:lineRule="auto"/>
-            </w:pPr>
-            <w:r>
-              <w:rPr>
-                <w:rFonts w:ascii="Calibri" w:cs="Calibri" w:eastAsia="Calibri" w:hAnsi="Calibri"/>
-                <w:b w:val="false"/>
-                <w:bCs w:val="false"/>
-                <w:i w:val="false"/>
-                <w:iCs w:val="false"/>
-                <w:color w:val="000000"/>
-                <w:sz w:val="20"/>
-                <w:szCs w:val="20"/>
-              </w:rPr>
-              <w:t xml:space="preserve">Surgeon</w:t>
+            <w:tcW w:type="dxa" w:w="1040"/>
+            <w:tcBorders>
+              <w:top w:val="single" w:color="BFBFBF" w:sz="2"/>
+              <w:left w:val="single" w:color="BFBFBF" w:sz="2"/>
+              <w:bottom w:val="single" w:color="BFBFBF" w:sz="2"/>
+              <w:right w:val="single" w:color="BFBFBF" w:sz="2"/>
+            </w:tcBorders>
+            <w:shd w:fill="FFFFFF" w:color="auto" w:val="clear"/>
+            <w:tcMar>
+              <w:top w:type="dxa" w:w="80"/>
+              <w:left w:type="dxa" w:w="120"/>
+              <w:bottom w:type="dxa" w:w="80"/>
+              <w:right w:type="dxa" w:w="120"/>
+            </w:tcMar>
+            <w:vAlign w:val="center"/>
+          </w:tcPr>
+          <w:p>
+            <w:pPr>
+              <w:widowControl/>
+              <w:spacing w:after="0" w:before="0" w:lineRule="auto"/>
+            </w:pPr>
+            <w:r>
+              <w:rPr>
+                <w:rFonts w:ascii="Calibri" w:cs="Calibri" w:eastAsia="Calibri" w:hAnsi="Calibri"/>
+                <w:b w:val="false"/>
+                <w:bCs w:val="false"/>
+                <w:i w:val="false"/>
+                <w:iCs w:val="false"/>
+                <w:color w:val="000000"/>
+                <w:sz w:val="20"/>
+                <w:szCs w:val="20"/>
+              </w:rPr>
+              <w:t xml:space="preserve">F31-1</w:t>
+            </w:r>
+          </w:p>
+        </w:tc>
+        <w:tc>
+          <w:tcPr>
+            <w:tcW w:type="dxa" w:w="2300"/>
+            <w:tcBorders>
+              <w:top w:val="single" w:color="BFBFBF" w:sz="2"/>
+              <w:left w:val="single" w:color="BFBFBF" w:sz="2"/>
+              <w:bottom w:val="single" w:color="BFBFBF" w:sz="2"/>
+              <w:right w:val="single" w:color="BFBFBF" w:sz="2"/>
+            </w:tcBorders>
+            <w:shd w:fill="FFFFFF" w:color="auto" w:val="clear"/>
+            <w:tcMar>
+              <w:top w:type="dxa" w:w="80"/>
+              <w:left w:type="dxa" w:w="120"/>
+              <w:bottom w:type="dxa" w:w="80"/>
+              <w:right w:type="dxa" w:w="120"/>
+            </w:tcMar>
+            <w:vAlign w:val="center"/>
+          </w:tcPr>
+          <w:p>
+            <w:pPr>
+              <w:widowControl/>
+              <w:spacing w:after="0" w:before="0" w:lineRule="auto"/>
+            </w:pPr>
+            <w:r>
+              <w:rPr>
+                <w:rFonts w:ascii="Calibri" w:cs="Calibri" w:eastAsia="Calibri" w:hAnsi="Calibri"/>
+                <w:b w:val="false"/>
+                <w:bCs w:val="false"/>
+                <w:i w:val="false"/>
+                <w:iCs w:val="false"/>
+                <w:color w:val="000000"/>
+                <w:sz w:val="20"/>
+                <w:szCs w:val="20"/>
+              </w:rPr>
+              <w:t xml:space="preserve">Save an F31 mhGAP Baseline during an active visit, then open the patient chart</w:t>
+            </w:r>
+          </w:p>
+        </w:tc>
+        <w:tc>
+          <w:tcPr>
+            <w:tcW w:type="dxa" w:w="2700"/>
+            <w:tcBorders>
+              <w:top w:val="single" w:color="BFBFBF" w:sz="2"/>
+              <w:left w:val="single" w:color="BFBFBF" w:sz="2"/>
+              <w:bottom w:val="single" w:color="BFBFBF" w:sz="2"/>
+              <w:right w:val="single" w:color="BFBFBF" w:sz="2"/>
+            </w:tcBorders>
+            <w:shd w:fill="FFFFFF" w:color="auto" w:val="clear"/>
+            <w:tcMar>
+              <w:top w:type="dxa" w:w="80"/>
+              <w:left w:type="dxa" w:w="120"/>
+              <w:bottom w:type="dxa" w:w="80"/>
+              <w:right w:type="dxa" w:w="120"/>
+            </w:tcMar>
+            <w:vAlign w:val="center"/>
+          </w:tcPr>
+          <w:p>
+            <w:pPr>
+              <w:widowControl/>
+              <w:spacing w:after="0" w:before="0" w:lineRule="auto"/>
+            </w:pPr>
+            <w:r>
+              <w:rPr>
+                <w:rFonts w:ascii="Calibri" w:cs="Calibri" w:eastAsia="Calibri" w:hAnsi="Calibri"/>
+                <w:b w:val="false"/>
+                <w:bCs w:val="false"/>
+                <w:i w:val="false"/>
+                <w:iCs w:val="false"/>
+                <w:color w:val="000000"/>
+                <w:sz w:val="20"/>
+                <w:szCs w:val="20"/>
+              </w:rPr>
+              <w:t xml:space="preserve">The form appears under the visit in the Visits tab and in Forms &amp; Notes</w:t>
+            </w:r>
+          </w:p>
+        </w:tc>
+        <w:tc>
+          <w:tcPr>
+            <w:tcW w:type="dxa" w:w="1720"/>
+            <w:tcBorders>
+              <w:top w:val="single" w:color="BFBFBF" w:sz="2"/>
+              <w:left w:val="single" w:color="BFBFBF" w:sz="2"/>
+              <w:bottom w:val="single" w:color="BFBFBF" w:sz="2"/>
+              <w:right w:val="single" w:color="BFBFBF" w:sz="2"/>
+            </w:tcBorders>
+            <w:shd w:fill="FFFFFF" w:color="auto" w:val="clear"/>
+            <w:tcMar>
+              <w:top w:type="dxa" w:w="80"/>
+              <w:left w:type="dxa" w:w="120"/>
+              <w:bottom w:type="dxa" w:w="80"/>
+              <w:right w:type="dxa" w:w="120"/>
+            </w:tcMar>
+            <w:vAlign w:val="center"/>
+          </w:tcPr>
+          <w:p>
+            <w:pPr>
+              <w:widowControl/>
+              <w:spacing w:after="0" w:before="0" w:lineRule="auto"/>
+            </w:pPr>
+            <w:r>
+              <w:rPr>
+                <w:rFonts w:ascii="Calibri" w:cs="Calibri" w:eastAsia="Calibri" w:hAnsi="Calibri"/>
+                <w:b w:val="false"/>
+                <w:bCs w:val="false"/>
+                <w:i w:val="false"/>
+                <w:iCs w:val="false"/>
+                <w:color w:val="000000"/>
+                <w:sz w:val="20"/>
+                <w:szCs w:val="20"/>
+              </w:rPr>
+              <w:t xml:space="preserve">Mental Health Counselor (MH counselor)</w:t>
+            </w:r>
+          </w:p>
+        </w:tc>
+        <w:tc>
+          <w:tcPr>
+            <w:tcW w:type="dxa" w:w="1600"/>
+            <w:tcBorders>
+              <w:top w:val="single" w:color="BFBFBF" w:sz="2"/>
+              <w:left w:val="single" w:color="BFBFBF" w:sz="2"/>
+              <w:bottom w:val="single" w:color="BFBFBF" w:sz="2"/>
+              <w:right w:val="single" w:color="BFBFBF" w:sz="2"/>
+            </w:tcBorders>
+            <w:shd w:fill="FFFFFF" w:color="auto" w:val="clear"/>
+            <w:tcMar>
+              <w:top w:type="dxa" w:w="80"/>
+              <w:left w:type="dxa" w:w="120"/>
+              <w:bottom w:type="dxa" w:w="80"/>
+              <w:right w:type="dxa" w:w="120"/>
+            </w:tcMar>
+            <w:vAlign w:val="center"/>
+          </w:tcPr>
+          <w:p>
+            <w:pPr>
+              <w:widowControl/>
+              <w:spacing w:after="0" w:before="0" w:lineRule="auto"/>
+            </w:pPr>
+            <w:r>
+              <w:rPr>
+                <w:rFonts w:ascii="Calibri" w:cs="Calibri" w:eastAsia="Calibri" w:hAnsi="Calibri"/>
+                <w:b w:val="false"/>
+                <w:bCs w:val="false"/>
+                <w:i w:val="false"/>
+                <w:iCs w:val="false"/>
+                <w:color w:val="000000"/>
+                <w:sz w:val="20"/>
+                <w:szCs w:val="20"/>
+              </w:rPr>
+              <w:t xml:space="preserve">To test</w:t>
             </w:r>
           </w:p>
         </w:tc>
@@ -1461,7 +1563,7 @@
         </w:trPr>
         <w:tc>
           <w:tcPr>
-            <w:tcW w:type="dxa" w:w="1100"/>
+            <w:tcW w:type="dxa" w:w="1040"/>
             <w:tcBorders>
               <w:top w:val="single" w:color="BFBFBF" w:sz="2"/>
               <w:left w:val="single" w:color="BFBFBF" w:sz="2"/>
@@ -1499,115 +1601,153 @@
         </w:tc>
         <w:tc>
           <w:tcPr>
-            <w:tcW w:type="dxa" w:w="3060"/>
-            <w:tcBorders>
-              <w:top w:val="single" w:color="BFBFBF" w:sz="2"/>
-              <w:left w:val="single" w:color="BFBFBF" w:sz="2"/>
-              <w:bottom w:val="single" w:color="BFBFBF" w:sz="2"/>
-              <w:right w:val="single" w:color="BFBFBF" w:sz="2"/>
-            </w:tcBorders>
-            <w:shd w:fill="FFFFFF" w:color="auto" w:val="clear"/>
-            <w:tcMar>
-              <w:top w:type="dxa" w:w="80"/>
-              <w:left w:type="dxa" w:w="120"/>
-              <w:bottom w:type="dxa" w:w="80"/>
-              <w:right w:type="dxa" w:w="120"/>
-            </w:tcMar>
-            <w:vAlign w:val="center"/>
-          </w:tcPr>
-          <w:p>
-            <w:pPr>
-              <w:widowControl/>
-              <w:spacing w:after="0" w:before="0" w:lineRule="auto"/>
-            </w:pPr>
-            <w:r>
-              <w:rPr>
-                <w:rFonts w:ascii="Calibri" w:cs="Calibri" w:eastAsia="Calibri" w:hAnsi="Calibri"/>
-                <w:b w:val="false"/>
-                <w:bCs w:val="false"/>
-                <w:i w:val="false"/>
-                <w:iCs w:val="false"/>
-                <w:color w:val="000000"/>
-                <w:sz w:val="20"/>
-                <w:szCs w:val="20"/>
-              </w:rPr>
-              <w:t xml:space="preserve">Register a new patient, then open their patient file</w:t>
-            </w:r>
-          </w:p>
-        </w:tc>
-        <w:tc>
-          <w:tcPr>
-            <w:tcW w:type="dxa" w:w="3500"/>
-            <w:tcBorders>
-              <w:top w:val="single" w:color="BFBFBF" w:sz="2"/>
-              <w:left w:val="single" w:color="BFBFBF" w:sz="2"/>
-              <w:bottom w:val="single" w:color="BFBFBF" w:sz="2"/>
-              <w:right w:val="single" w:color="BFBFBF" w:sz="2"/>
-            </w:tcBorders>
-            <w:shd w:fill="FFFFFF" w:color="auto" w:val="clear"/>
-            <w:tcMar>
-              <w:top w:type="dxa" w:w="80"/>
-              <w:left w:type="dxa" w:w="120"/>
-              <w:bottom w:type="dxa" w:w="80"/>
-              <w:right w:type="dxa" w:w="120"/>
-            </w:tcMar>
-            <w:vAlign w:val="center"/>
-          </w:tcPr>
-          <w:p>
-            <w:pPr>
-              <w:widowControl/>
-              <w:spacing w:after="0" w:before="0" w:lineRule="auto"/>
-            </w:pPr>
-            <w:r>
-              <w:rPr>
-                <w:rFonts w:ascii="Calibri" w:cs="Calibri" w:eastAsia="Calibri" w:hAnsi="Calibri"/>
-                <w:b w:val="false"/>
-                <w:bCs w:val="false"/>
-                <w:i w:val="false"/>
-                <w:iCs w:val="false"/>
-                <w:color w:val="000000"/>
-                <w:sz w:val="20"/>
-                <w:szCs w:val="20"/>
-              </w:rPr>
-              <w:t xml:space="preserve">Registration works; the patient file is not accessible</w:t>
-            </w:r>
-          </w:p>
-        </w:tc>
-        <w:tc>
-          <w:tcPr>
-            <w:tcW w:type="dxa" w:w="1700"/>
-            <w:tcBorders>
-              <w:top w:val="single" w:color="BFBFBF" w:sz="2"/>
-              <w:left w:val="single" w:color="BFBFBF" w:sz="2"/>
-              <w:bottom w:val="single" w:color="BFBFBF" w:sz="2"/>
-              <w:right w:val="single" w:color="BFBFBF" w:sz="2"/>
-            </w:tcBorders>
-            <w:shd w:fill="FFFFFF" w:color="auto" w:val="clear"/>
-            <w:tcMar>
-              <w:top w:type="dxa" w:w="80"/>
-              <w:left w:type="dxa" w:w="120"/>
-              <w:bottom w:type="dxa" w:w="80"/>
-              <w:right w:type="dxa" w:w="120"/>
-            </w:tcMar>
-            <w:vAlign w:val="center"/>
-          </w:tcPr>
-          <w:p>
-            <w:pPr>
-              <w:widowControl/>
-              <w:spacing w:after="0" w:before="0" w:lineRule="auto"/>
-            </w:pPr>
-            <w:r>
-              <w:rPr>
-                <w:rFonts w:ascii="Calibri" w:cs="Calibri" w:eastAsia="Calibri" w:hAnsi="Calibri"/>
-                <w:b w:val="false"/>
-                <w:bCs w:val="false"/>
-                <w:i w:val="false"/>
-                <w:iCs w:val="false"/>
-                <w:color w:val="000000"/>
-                <w:sz w:val="20"/>
-                <w:szCs w:val="20"/>
-              </w:rPr>
-              <w:t xml:space="preserve">Registration Clerk</w:t>
+            <w:tcW w:type="dxa" w:w="2300"/>
+            <w:tcBorders>
+              <w:top w:val="single" w:color="BFBFBF" w:sz="2"/>
+              <w:left w:val="single" w:color="BFBFBF" w:sz="2"/>
+              <w:bottom w:val="single" w:color="BFBFBF" w:sz="2"/>
+              <w:right w:val="single" w:color="BFBFBF" w:sz="2"/>
+            </w:tcBorders>
+            <w:shd w:fill="FFFFFF" w:color="auto" w:val="clear"/>
+            <w:tcMar>
+              <w:top w:type="dxa" w:w="80"/>
+              <w:left w:type="dxa" w:w="120"/>
+              <w:bottom w:type="dxa" w:w="80"/>
+              <w:right w:type="dxa" w:w="120"/>
+            </w:tcMar>
+            <w:vAlign w:val="center"/>
+          </w:tcPr>
+          <w:p>
+            <w:pPr>
+              <w:widowControl/>
+              <w:spacing w:after="0" w:before="0" w:lineRule="auto"/>
+            </w:pPr>
+            <w:r>
+              <w:rPr>
+                <w:rFonts w:ascii="Calibri" w:cs="Calibri" w:eastAsia="Calibri" w:hAnsi="Calibri"/>
+                <w:b w:val="false"/>
+                <w:bCs w:val="false"/>
+                <w:i w:val="false"/>
+                <w:iCs w:val="false"/>
+                <w:color w:val="000000"/>
+                <w:sz w:val="20"/>
+                <w:szCs w:val="20"/>
+              </w:rPr>
+              <w:t xml:space="preserve">Open the patient chart of a mental health patient</w:t>
+            </w:r>
+          </w:p>
+        </w:tc>
+        <w:tc>
+          <w:tcPr>
+            <w:tcW w:type="dxa" w:w="2700"/>
+            <w:tcBorders>
+              <w:top w:val="single" w:color="BFBFBF" w:sz="2"/>
+              <w:left w:val="single" w:color="BFBFBF" w:sz="2"/>
+              <w:bottom w:val="single" w:color="BFBFBF" w:sz="2"/>
+              <w:right w:val="single" w:color="BFBFBF" w:sz="2"/>
+            </w:tcBorders>
+            <w:shd w:fill="FFFFFF" w:color="auto" w:val="clear"/>
+            <w:tcMar>
+              <w:top w:type="dxa" w:w="80"/>
+              <w:left w:type="dxa" w:w="120"/>
+              <w:bottom w:type="dxa" w:w="80"/>
+              <w:right w:type="dxa" w:w="120"/>
+            </w:tcMar>
+            <w:vAlign w:val="center"/>
+          </w:tcPr>
+          <w:p>
+            <w:pPr>
+              <w:widowControl/>
+              <w:spacing w:after="0" w:before="0" w:lineRule="auto"/>
+            </w:pPr>
+            <w:r>
+              <w:rPr>
+                <w:rFonts w:ascii="Calibri" w:cs="Calibri" w:eastAsia="Calibri" w:hAnsi="Calibri"/>
+                <w:b w:val="false"/>
+                <w:bCs w:val="false"/>
+                <w:i w:val="false"/>
+                <w:iCs w:val="false"/>
+                <w:color w:val="000000"/>
+                <w:sz w:val="20"/>
+                <w:szCs w:val="20"/>
+              </w:rPr>
+              <w:t xml:space="preserve">Mental health forms are not visible</w:t>
+            </w:r>
+          </w:p>
+        </w:tc>
+        <w:tc>
+          <w:tcPr>
+            <w:tcW w:type="dxa" w:w="1720"/>
+            <w:tcBorders>
+              <w:top w:val="single" w:color="BFBFBF" w:sz="2"/>
+              <w:left w:val="single" w:color="BFBFBF" w:sz="2"/>
+              <w:bottom w:val="single" w:color="BFBFBF" w:sz="2"/>
+              <w:right w:val="single" w:color="BFBFBF" w:sz="2"/>
+            </w:tcBorders>
+            <w:shd w:fill="FFFFFF" w:color="auto" w:val="clear"/>
+            <w:tcMar>
+              <w:top w:type="dxa" w:w="80"/>
+              <w:left w:type="dxa" w:w="120"/>
+              <w:bottom w:type="dxa" w:w="80"/>
+              <w:right w:type="dxa" w:w="120"/>
+            </w:tcMar>
+            <w:vAlign w:val="center"/>
+          </w:tcPr>
+          <w:p>
+            <w:pPr>
+              <w:widowControl/>
+              <w:spacing w:after="0" w:before="0" w:lineRule="auto"/>
+            </w:pPr>
+            <w:r>
+              <w:rPr>
+                <w:rFonts w:ascii="Calibri" w:cs="Calibri" w:eastAsia="Calibri" w:hAnsi="Calibri"/>
+                <w:b w:val="false"/>
+                <w:bCs w:val="false"/>
+                <w:i w:val="false"/>
+                <w:iCs w:val="false"/>
+                <w:color w:val="000000"/>
+                <w:sz w:val="20"/>
+                <w:szCs w:val="20"/>
+              </w:rPr>
+              <w:t xml:space="preserve">Registration Officer (Registration Clerk)</w:t>
+            </w:r>
+          </w:p>
+        </w:tc>
+        <w:tc>
+          <w:tcPr>
+            <w:tcW w:type="dxa" w:w="1600"/>
+            <w:tcBorders>
+              <w:top w:val="single" w:color="BFBFBF" w:sz="2"/>
+              <w:left w:val="single" w:color="BFBFBF" w:sz="2"/>
+              <w:bottom w:val="single" w:color="BFBFBF" w:sz="2"/>
+              <w:right w:val="single" w:color="BFBFBF" w:sz="2"/>
+            </w:tcBorders>
+            <w:shd w:fill="FFFFFF" w:color="auto" w:val="clear"/>
+            <w:tcMar>
+              <w:top w:type="dxa" w:w="80"/>
+              <w:left w:type="dxa" w:w="120"/>
+              <w:bottom w:type="dxa" w:w="80"/>
+              <w:right w:type="dxa" w:w="120"/>
+            </w:tcMar>
+            <w:vAlign w:val="center"/>
+          </w:tcPr>
+          <w:p>
+            <w:pPr>
+              <w:widowControl/>
+              <w:spacing w:after="0" w:before="0" w:lineRule="auto"/>
+            </w:pPr>
+            <w:r>
+              <w:rPr>
+                <w:rFonts w:ascii="Calibri" w:cs="Calibri" w:eastAsia="Calibri" w:hAnsi="Calibri"/>
+                <w:b w:val="false"/>
+                <w:bCs w:val="false"/>
+                <w:i w:val="false"/>
+                <w:iCs w:val="false"/>
+                <w:color w:val="000000"/>
+                <w:sz w:val="20"/>
+                <w:szCs w:val="20"/>
+              </w:rPr>
+              <w:t xml:space="preserve">✅ Config matches</w:t>
             </w:r>
           </w:p>
         </w:tc>
@@ -1618,7 +1758,7 @@
         </w:trPr>
         <w:tc>
           <w:tcPr>
-            <w:tcW w:type="dxa" w:w="1100"/>
+            <w:tcW w:type="dxa" w:w="1040"/>
             <w:tcBorders>
               <w:top w:val="single" w:color="BFBFBF" w:sz="2"/>
               <w:left w:val="single" w:color="BFBFBF" w:sz="2"/>
@@ -1656,115 +1796,153 @@
         </w:tc>
         <w:tc>
           <w:tcPr>
-            <w:tcW w:type="dxa" w:w="3060"/>
-            <w:tcBorders>
-              <w:top w:val="single" w:color="BFBFBF" w:sz="2"/>
-              <w:left w:val="single" w:color="BFBFBF" w:sz="2"/>
-              <w:bottom w:val="single" w:color="BFBFBF" w:sz="2"/>
-              <w:right w:val="single" w:color="BFBFBF" w:sz="2"/>
-            </w:tcBorders>
-            <w:shd w:fill="FFFFFF" w:color="auto" w:val="clear"/>
-            <w:tcMar>
-              <w:top w:type="dxa" w:w="80"/>
-              <w:left w:type="dxa" w:w="120"/>
-              <w:bottom w:type="dxa" w:w="80"/>
-              <w:right w:type="dxa" w:w="120"/>
-            </w:tcMar>
-            <w:vAlign w:val="center"/>
-          </w:tcPr>
-          <w:p>
-            <w:pPr>
-              <w:widowControl/>
-              <w:spacing w:after="0" w:before="0" w:lineRule="auto"/>
-            </w:pPr>
-            <w:r>
-              <w:rPr>
-                <w:rFonts w:ascii="Calibri" w:cs="Calibri" w:eastAsia="Calibri" w:hAnsi="Calibri"/>
-                <w:b w:val="false"/>
-                <w:bCs w:val="false"/>
-                <w:i w:val="false"/>
-                <w:iCs w:val="false"/>
-                <w:color w:val="000000"/>
-                <w:sz w:val="20"/>
-                <w:szCs w:val="20"/>
-              </w:rPr>
-              <w:t xml:space="preserve">Open a patient file, try to order a lab test</w:t>
-            </w:r>
-          </w:p>
-        </w:tc>
-        <w:tc>
-          <w:tcPr>
-            <w:tcW w:type="dxa" w:w="3500"/>
-            <w:tcBorders>
-              <w:top w:val="single" w:color="BFBFBF" w:sz="2"/>
-              <w:left w:val="single" w:color="BFBFBF" w:sz="2"/>
-              <w:bottom w:val="single" w:color="BFBFBF" w:sz="2"/>
-              <w:right w:val="single" w:color="BFBFBF" w:sz="2"/>
-            </w:tcBorders>
-            <w:shd w:fill="FFFFFF" w:color="auto" w:val="clear"/>
-            <w:tcMar>
-              <w:top w:type="dxa" w:w="80"/>
-              <w:left w:type="dxa" w:w="120"/>
-              <w:bottom w:type="dxa" w:w="80"/>
-              <w:right w:type="dxa" w:w="120"/>
-            </w:tcMar>
-            <w:vAlign w:val="center"/>
-          </w:tcPr>
-          <w:p>
-            <w:pPr>
-              <w:widowControl/>
-              <w:spacing w:after="0" w:before="0" w:lineRule="auto"/>
-            </w:pPr>
-            <w:r>
-              <w:rPr>
-                <w:rFonts w:ascii="Calibri" w:cs="Calibri" w:eastAsia="Calibri" w:hAnsi="Calibri"/>
-                <w:b w:val="false"/>
-                <w:bCs w:val="false"/>
-                <w:i w:val="false"/>
-                <w:iCs w:val="false"/>
-                <w:color w:val="000000"/>
-                <w:sz w:val="20"/>
-                <w:szCs w:val="20"/>
-              </w:rPr>
-              <w:t xml:space="preserve">No lab order option</w:t>
-            </w:r>
-          </w:p>
-        </w:tc>
-        <w:tc>
-          <w:tcPr>
-            <w:tcW w:type="dxa" w:w="1700"/>
-            <w:tcBorders>
-              <w:top w:val="single" w:color="BFBFBF" w:sz="2"/>
-              <w:left w:val="single" w:color="BFBFBF" w:sz="2"/>
-              <w:bottom w:val="single" w:color="BFBFBF" w:sz="2"/>
-              <w:right w:val="single" w:color="BFBFBF" w:sz="2"/>
-            </w:tcBorders>
-            <w:shd w:fill="FFFFFF" w:color="auto" w:val="clear"/>
-            <w:tcMar>
-              <w:top w:type="dxa" w:w="80"/>
-              <w:left w:type="dxa" w:w="120"/>
-              <w:bottom w:type="dxa" w:w="80"/>
-              <w:right w:type="dxa" w:w="120"/>
-            </w:tcMar>
-            <w:vAlign w:val="center"/>
-          </w:tcPr>
-          <w:p>
-            <w:pPr>
-              <w:widowControl/>
-              <w:spacing w:after="0" w:before="0" w:lineRule="auto"/>
-            </w:pPr>
-            <w:r>
-              <w:rPr>
-                <w:rFonts w:ascii="Calibri" w:cs="Calibri" w:eastAsia="Calibri" w:hAnsi="Calibri"/>
-                <w:b w:val="false"/>
-                <w:bCs w:val="false"/>
-                <w:i w:val="false"/>
-                <w:iCs w:val="false"/>
-                <w:color w:val="000000"/>
-                <w:sz w:val="20"/>
-                <w:szCs w:val="20"/>
-              </w:rPr>
-              <w:t xml:space="preserve">MH counselor</w:t>
+            <w:tcW w:type="dxa" w:w="2300"/>
+            <w:tcBorders>
+              <w:top w:val="single" w:color="BFBFBF" w:sz="2"/>
+              <w:left w:val="single" w:color="BFBFBF" w:sz="2"/>
+              <w:bottom w:val="single" w:color="BFBFBF" w:sz="2"/>
+              <w:right w:val="single" w:color="BFBFBF" w:sz="2"/>
+            </w:tcBorders>
+            <w:shd w:fill="FFFFFF" w:color="auto" w:val="clear"/>
+            <w:tcMar>
+              <w:top w:type="dxa" w:w="80"/>
+              <w:left w:type="dxa" w:w="120"/>
+              <w:bottom w:type="dxa" w:w="80"/>
+              <w:right w:type="dxa" w:w="120"/>
+            </w:tcMar>
+            <w:vAlign w:val="center"/>
+          </w:tcPr>
+          <w:p>
+            <w:pPr>
+              <w:widowControl/>
+              <w:spacing w:after="0" w:before="0" w:lineRule="auto"/>
+            </w:pPr>
+            <w:r>
+              <w:rPr>
+                <w:rFonts w:ascii="Calibri" w:cs="Calibri" w:eastAsia="Calibri" w:hAnsi="Calibri"/>
+                <w:b w:val="false"/>
+                <w:bCs w:val="false"/>
+                <w:i w:val="false"/>
+                <w:iCs w:val="false"/>
+                <w:color w:val="000000"/>
+                <w:sz w:val="20"/>
+                <w:szCs w:val="20"/>
+              </w:rPr>
+              <w:t xml:space="preserve">Open an F31 mhGAP Baseline, go to Clinical diagnosis</w:t>
+            </w:r>
+          </w:p>
+        </w:tc>
+        <w:tc>
+          <w:tcPr>
+            <w:tcW w:type="dxa" w:w="2700"/>
+            <w:tcBorders>
+              <w:top w:val="single" w:color="BFBFBF" w:sz="2"/>
+              <w:left w:val="single" w:color="BFBFBF" w:sz="2"/>
+              <w:bottom w:val="single" w:color="BFBFBF" w:sz="2"/>
+              <w:right w:val="single" w:color="BFBFBF" w:sz="2"/>
+            </w:tcBorders>
+            <w:shd w:fill="FFFFFF" w:color="auto" w:val="clear"/>
+            <w:tcMar>
+              <w:top w:type="dxa" w:w="80"/>
+              <w:left w:type="dxa" w:w="120"/>
+              <w:bottom w:type="dxa" w:w="80"/>
+              <w:right w:type="dxa" w:w="120"/>
+            </w:tcMar>
+            <w:vAlign w:val="center"/>
+          </w:tcPr>
+          <w:p>
+            <w:pPr>
+              <w:widowControl/>
+              <w:spacing w:after="0" w:before="0" w:lineRule="auto"/>
+            </w:pPr>
+            <w:r>
+              <w:rPr>
+                <w:rFonts w:ascii="Calibri" w:cs="Calibri" w:eastAsia="Calibri" w:hAnsi="Calibri"/>
+                <w:b w:val="false"/>
+                <w:bCs w:val="false"/>
+                <w:i w:val="false"/>
+                <w:iCs w:val="false"/>
+                <w:color w:val="000000"/>
+                <w:sz w:val="20"/>
+                <w:szCs w:val="20"/>
+              </w:rPr>
+              <w:t xml:space="preserve">The section is read-only without the « Edit sensitive mental health fields » right</w:t>
+            </w:r>
+          </w:p>
+        </w:tc>
+        <w:tc>
+          <w:tcPr>
+            <w:tcW w:type="dxa" w:w="1720"/>
+            <w:tcBorders>
+              <w:top w:val="single" w:color="BFBFBF" w:sz="2"/>
+              <w:left w:val="single" w:color="BFBFBF" w:sz="2"/>
+              <w:bottom w:val="single" w:color="BFBFBF" w:sz="2"/>
+              <w:right w:val="single" w:color="BFBFBF" w:sz="2"/>
+            </w:tcBorders>
+            <w:shd w:fill="FFFFFF" w:color="auto" w:val="clear"/>
+            <w:tcMar>
+              <w:top w:type="dxa" w:w="80"/>
+              <w:left w:type="dxa" w:w="120"/>
+              <w:bottom w:type="dxa" w:w="80"/>
+              <w:right w:type="dxa" w:w="120"/>
+            </w:tcMar>
+            <w:vAlign w:val="center"/>
+          </w:tcPr>
+          <w:p>
+            <w:pPr>
+              <w:widowControl/>
+              <w:spacing w:after="0" w:before="0" w:lineRule="auto"/>
+            </w:pPr>
+            <w:r>
+              <w:rPr>
+                <w:rFonts w:ascii="Calibri" w:cs="Calibri" w:eastAsia="Calibri" w:hAnsi="Calibri"/>
+                <w:b w:val="false"/>
+                <w:bCs w:val="false"/>
+                <w:i w:val="false"/>
+                <w:iCs w:val="false"/>
+                <w:color w:val="000000"/>
+                <w:sz w:val="20"/>
+                <w:szCs w:val="20"/>
+              </w:rPr>
+              <w:t xml:space="preserve">Mental Health Nurse</w:t>
+            </w:r>
+          </w:p>
+        </w:tc>
+        <w:tc>
+          <w:tcPr>
+            <w:tcW w:type="dxa" w:w="1600"/>
+            <w:tcBorders>
+              <w:top w:val="single" w:color="BFBFBF" w:sz="2"/>
+              <w:left w:val="single" w:color="BFBFBF" w:sz="2"/>
+              <w:bottom w:val="single" w:color="BFBFBF" w:sz="2"/>
+              <w:right w:val="single" w:color="BFBFBF" w:sz="2"/>
+            </w:tcBorders>
+            <w:shd w:fill="FFFFFF" w:color="auto" w:val="clear"/>
+            <w:tcMar>
+              <w:top w:type="dxa" w:w="80"/>
+              <w:left w:type="dxa" w:w="120"/>
+              <w:bottom w:type="dxa" w:w="80"/>
+              <w:right w:type="dxa" w:w="120"/>
+            </w:tcMar>
+            <w:vAlign w:val="center"/>
+          </w:tcPr>
+          <w:p>
+            <w:pPr>
+              <w:widowControl/>
+              <w:spacing w:after="0" w:before="0" w:lineRule="auto"/>
+            </w:pPr>
+            <w:r>
+              <w:rPr>
+                <w:rFonts w:ascii="Calibri" w:cs="Calibri" w:eastAsia="Calibri" w:hAnsi="Calibri"/>
+                <w:b w:val="false"/>
+                <w:bCs w:val="false"/>
+                <w:i w:val="false"/>
+                <w:iCs w:val="false"/>
+                <w:color w:val="000000"/>
+                <w:sz w:val="20"/>
+                <w:szCs w:val="20"/>
+              </w:rPr>
+              <w:t xml:space="preserve">❌ Not locked in F31 (was in F03)</w:t>
             </w:r>
           </w:p>
         </w:tc>
@@ -1775,7 +1953,7 @@
         </w:trPr>
         <w:tc>
           <w:tcPr>
-            <w:tcW w:type="dxa" w:w="1100"/>
+            <w:tcW w:type="dxa" w:w="1040"/>
             <w:tcBorders>
               <w:top w:val="single" w:color="BFBFBF" w:sz="2"/>
               <w:left w:val="single" w:color="BFBFBF" w:sz="2"/>
@@ -1813,115 +1991,153 @@
         </w:tc>
         <w:tc>
           <w:tcPr>
-            <w:tcW w:type="dxa" w:w="3060"/>
-            <w:tcBorders>
-              <w:top w:val="single" w:color="BFBFBF" w:sz="2"/>
-              <w:left w:val="single" w:color="BFBFBF" w:sz="2"/>
-              <w:bottom w:val="single" w:color="BFBFBF" w:sz="2"/>
-              <w:right w:val="single" w:color="BFBFBF" w:sz="2"/>
-            </w:tcBorders>
-            <w:shd w:fill="FFFFFF" w:color="auto" w:val="clear"/>
-            <w:tcMar>
-              <w:top w:type="dxa" w:w="80"/>
-              <w:left w:type="dxa" w:w="120"/>
-              <w:bottom w:type="dxa" w:w="80"/>
-              <w:right w:type="dxa" w:w="120"/>
-            </w:tcMar>
-            <w:vAlign w:val="center"/>
-          </w:tcPr>
-          <w:p>
-            <w:pPr>
-              <w:widowControl/>
-              <w:spacing w:after="0" w:before="0" w:lineRule="auto"/>
-            </w:pPr>
-            <w:r>
-              <w:rPr>
-                <w:rFonts w:ascii="Calibri" w:cs="Calibri" w:eastAsia="Calibri" w:hAnsi="Calibri"/>
-                <w:b w:val="false"/>
-                <w:bCs w:val="false"/>
-                <w:i w:val="false"/>
-                <w:iCs w:val="false"/>
-                <w:color w:val="000000"/>
-                <w:sz w:val="20"/>
-                <w:szCs w:val="20"/>
-              </w:rPr>
-              <w:t xml:space="preserve">Open a patient file, go to Vitals</w:t>
-            </w:r>
-          </w:p>
-        </w:tc>
-        <w:tc>
-          <w:tcPr>
-            <w:tcW w:type="dxa" w:w="3500"/>
-            <w:tcBorders>
-              <w:top w:val="single" w:color="BFBFBF" w:sz="2"/>
-              <w:left w:val="single" w:color="BFBFBF" w:sz="2"/>
-              <w:bottom w:val="single" w:color="BFBFBF" w:sz="2"/>
-              <w:right w:val="single" w:color="BFBFBF" w:sz="2"/>
-            </w:tcBorders>
-            <w:shd w:fill="FFFFFF" w:color="auto" w:val="clear"/>
-            <w:tcMar>
-              <w:top w:type="dxa" w:w="80"/>
-              <w:left w:type="dxa" w:w="120"/>
-              <w:bottom w:type="dxa" w:w="80"/>
-              <w:right w:type="dxa" w:w="120"/>
-            </w:tcMar>
-            <w:vAlign w:val="center"/>
-          </w:tcPr>
-          <w:p>
-            <w:pPr>
-              <w:widowControl/>
-              <w:spacing w:after="0" w:before="0" w:lineRule="auto"/>
-            </w:pPr>
-            <w:r>
-              <w:rPr>
-                <w:rFonts w:ascii="Calibri" w:cs="Calibri" w:eastAsia="Calibri" w:hAnsi="Calibri"/>
-                <w:b w:val="false"/>
-                <w:bCs w:val="false"/>
-                <w:i w:val="false"/>
-                <w:iCs w:val="false"/>
-                <w:color w:val="000000"/>
-                <w:sz w:val="20"/>
-                <w:szCs w:val="20"/>
-              </w:rPr>
-              <w:t xml:space="preserve">Vitals are visible, no « Add » button</w:t>
-            </w:r>
-          </w:p>
-        </w:tc>
-        <w:tc>
-          <w:tcPr>
-            <w:tcW w:type="dxa" w:w="1700"/>
-            <w:tcBorders>
-              <w:top w:val="single" w:color="BFBFBF" w:sz="2"/>
-              <w:left w:val="single" w:color="BFBFBF" w:sz="2"/>
-              <w:bottom w:val="single" w:color="BFBFBF" w:sz="2"/>
-              <w:right w:val="single" w:color="BFBFBF" w:sz="2"/>
-            </w:tcBorders>
-            <w:shd w:fill="FFFFFF" w:color="auto" w:val="clear"/>
-            <w:tcMar>
-              <w:top w:type="dxa" w:w="80"/>
-              <w:left w:type="dxa" w:w="120"/>
-              <w:bottom w:type="dxa" w:w="80"/>
-              <w:right w:type="dxa" w:w="120"/>
-            </w:tcMar>
-            <w:vAlign w:val="center"/>
-          </w:tcPr>
-          <w:p>
-            <w:pPr>
-              <w:widowControl/>
-              <w:spacing w:after="0" w:before="0" w:lineRule="auto"/>
-            </w:pPr>
-            <w:r>
-              <w:rPr>
-                <w:rFonts w:ascii="Calibri" w:cs="Calibri" w:eastAsia="Calibri" w:hAnsi="Calibri"/>
-                <w:b w:val="false"/>
-                <w:bCs w:val="false"/>
-                <w:i w:val="false"/>
-                <w:iCs w:val="false"/>
-                <w:color w:val="000000"/>
-                <w:sz w:val="20"/>
-                <w:szCs w:val="20"/>
-              </w:rPr>
-              <w:t xml:space="preserve">MedCo</w:t>
+            <w:tcW w:type="dxa" w:w="2300"/>
+            <w:tcBorders>
+              <w:top w:val="single" w:color="BFBFBF" w:sz="2"/>
+              <w:left w:val="single" w:color="BFBFBF" w:sz="2"/>
+              <w:bottom w:val="single" w:color="BFBFBF" w:sz="2"/>
+              <w:right w:val="single" w:color="BFBFBF" w:sz="2"/>
+            </w:tcBorders>
+            <w:shd w:fill="FFFFFF" w:color="auto" w:val="clear"/>
+            <w:tcMar>
+              <w:top w:type="dxa" w:w="80"/>
+              <w:left w:type="dxa" w:w="120"/>
+              <w:bottom w:type="dxa" w:w="80"/>
+              <w:right w:type="dxa" w:w="120"/>
+            </w:tcMar>
+            <w:vAlign w:val="center"/>
+          </w:tcPr>
+          <w:p>
+            <w:pPr>
+              <w:widowControl/>
+              <w:spacing w:after="0" w:before="0" w:lineRule="auto"/>
+            </w:pPr>
+            <w:r>
+              <w:rPr>
+                <w:rFonts w:ascii="Calibri" w:cs="Calibri" w:eastAsia="Calibri" w:hAnsi="Calibri"/>
+                <w:b w:val="false"/>
+                <w:bCs w:val="false"/>
+                <w:i w:val="false"/>
+                <w:iCs w:val="false"/>
+                <w:color w:val="000000"/>
+                <w:sz w:val="20"/>
+                <w:szCs w:val="20"/>
+              </w:rPr>
+              <w:t xml:space="preserve">Open the order basket, try to order a lab test</w:t>
+            </w:r>
+          </w:p>
+        </w:tc>
+        <w:tc>
+          <w:tcPr>
+            <w:tcW w:type="dxa" w:w="2700"/>
+            <w:tcBorders>
+              <w:top w:val="single" w:color="BFBFBF" w:sz="2"/>
+              <w:left w:val="single" w:color="BFBFBF" w:sz="2"/>
+              <w:bottom w:val="single" w:color="BFBFBF" w:sz="2"/>
+              <w:right w:val="single" w:color="BFBFBF" w:sz="2"/>
+            </w:tcBorders>
+            <w:shd w:fill="FFFFFF" w:color="auto" w:val="clear"/>
+            <w:tcMar>
+              <w:top w:type="dxa" w:w="80"/>
+              <w:left w:type="dxa" w:w="120"/>
+              <w:bottom w:type="dxa" w:w="80"/>
+              <w:right w:type="dxa" w:w="120"/>
+            </w:tcMar>
+            <w:vAlign w:val="center"/>
+          </w:tcPr>
+          <w:p>
+            <w:pPr>
+              <w:widowControl/>
+              <w:spacing w:after="0" w:before="0" w:lineRule="auto"/>
+            </w:pPr>
+            <w:r>
+              <w:rPr>
+                <w:rFonts w:ascii="Calibri" w:cs="Calibri" w:eastAsia="Calibri" w:hAnsi="Calibri"/>
+                <w:b w:val="false"/>
+                <w:bCs w:val="false"/>
+                <w:i w:val="false"/>
+                <w:iCs w:val="false"/>
+                <w:color w:val="000000"/>
+                <w:sz w:val="20"/>
+                <w:szCs w:val="20"/>
+              </w:rPr>
+              <w:t xml:space="preserve">No lab order option</w:t>
+            </w:r>
+          </w:p>
+        </w:tc>
+        <w:tc>
+          <w:tcPr>
+            <w:tcW w:type="dxa" w:w="1720"/>
+            <w:tcBorders>
+              <w:top w:val="single" w:color="BFBFBF" w:sz="2"/>
+              <w:left w:val="single" w:color="BFBFBF" w:sz="2"/>
+              <w:bottom w:val="single" w:color="BFBFBF" w:sz="2"/>
+              <w:right w:val="single" w:color="BFBFBF" w:sz="2"/>
+            </w:tcBorders>
+            <w:shd w:fill="FFFFFF" w:color="auto" w:val="clear"/>
+            <w:tcMar>
+              <w:top w:type="dxa" w:w="80"/>
+              <w:left w:type="dxa" w:w="120"/>
+              <w:bottom w:type="dxa" w:w="80"/>
+              <w:right w:type="dxa" w:w="120"/>
+            </w:tcMar>
+            <w:vAlign w:val="center"/>
+          </w:tcPr>
+          <w:p>
+            <w:pPr>
+              <w:widowControl/>
+              <w:spacing w:after="0" w:before="0" w:lineRule="auto"/>
+            </w:pPr>
+            <w:r>
+              <w:rPr>
+                <w:rFonts w:ascii="Calibri" w:cs="Calibri" w:eastAsia="Calibri" w:hAnsi="Calibri"/>
+                <w:b w:val="false"/>
+                <w:bCs w:val="false"/>
+                <w:i w:val="false"/>
+                <w:iCs w:val="false"/>
+                <w:color w:val="000000"/>
+                <w:sz w:val="20"/>
+                <w:szCs w:val="20"/>
+              </w:rPr>
+              <w:t xml:space="preserve">Mental Health Counselor (MH counselor)</w:t>
+            </w:r>
+          </w:p>
+        </w:tc>
+        <w:tc>
+          <w:tcPr>
+            <w:tcW w:type="dxa" w:w="1600"/>
+            <w:tcBorders>
+              <w:top w:val="single" w:color="BFBFBF" w:sz="2"/>
+              <w:left w:val="single" w:color="BFBFBF" w:sz="2"/>
+              <w:bottom w:val="single" w:color="BFBFBF" w:sz="2"/>
+              <w:right w:val="single" w:color="BFBFBF" w:sz="2"/>
+            </w:tcBorders>
+            <w:shd w:fill="FFFFFF" w:color="auto" w:val="clear"/>
+            <w:tcMar>
+              <w:top w:type="dxa" w:w="80"/>
+              <w:left w:type="dxa" w:w="120"/>
+              <w:bottom w:type="dxa" w:w="80"/>
+              <w:right w:type="dxa" w:w="120"/>
+            </w:tcMar>
+            <w:vAlign w:val="center"/>
+          </w:tcPr>
+          <w:p>
+            <w:pPr>
+              <w:widowControl/>
+              <w:spacing w:after="0" w:before="0" w:lineRule="auto"/>
+            </w:pPr>
+            <w:r>
+              <w:rPr>
+                <w:rFonts w:ascii="Calibri" w:cs="Calibri" w:eastAsia="Calibri" w:hAnsi="Calibri"/>
+                <w:b w:val="false"/>
+                <w:bCs w:val="false"/>
+                <w:i w:val="false"/>
+                <w:iCs w:val="false"/>
+                <w:color w:val="000000"/>
+                <w:sz w:val="20"/>
+                <w:szCs w:val="20"/>
+              </w:rPr>
+              <w:t xml:space="preserve">❌ The EMR role can add orders</w:t>
             </w:r>
           </w:p>
         </w:tc>
@@ -1932,153 +2148,191 @@
         </w:trPr>
         <w:tc>
           <w:tcPr>
-            <w:tcW w:type="dxa" w:w="1100"/>
-            <w:tcBorders>
-              <w:top w:val="single" w:color="BFBFBF" w:sz="2"/>
-              <w:left w:val="single" w:color="BFBFBF" w:sz="2"/>
-              <w:bottom w:val="single" w:color="BFBFBF" w:sz="2"/>
-              <w:right w:val="single" w:color="BFBFBF" w:sz="2"/>
-            </w:tcBorders>
-            <w:shd w:fill="FFFFFF" w:color="auto" w:val="clear"/>
-            <w:tcMar>
-              <w:top w:type="dxa" w:w="80"/>
-              <w:left w:type="dxa" w:w="120"/>
-              <w:bottom w:type="dxa" w:w="80"/>
-              <w:right w:type="dxa" w:w="120"/>
-            </w:tcMar>
-            <w:vAlign w:val="center"/>
-          </w:tcPr>
-          <w:p>
-            <w:pPr>
-              <w:widowControl/>
-              <w:spacing w:after="0" w:before="0" w:lineRule="auto"/>
-            </w:pPr>
-            <w:r>
-              <w:rPr>
-                <w:rFonts w:ascii="Calibri" w:cs="Calibri" w:eastAsia="Calibri" w:hAnsi="Calibri"/>
-                <w:b w:val="false"/>
-                <w:bCs w:val="false"/>
-                <w:i w:val="false"/>
-                <w:iCs w:val="false"/>
-                <w:color w:val="000000"/>
-                <w:sz w:val="20"/>
-                <w:szCs w:val="20"/>
-              </w:rPr>
-              <w:t xml:space="preserve">REG-1</w:t>
-            </w:r>
-          </w:p>
-        </w:tc>
-        <w:tc>
-          <w:tcPr>
-            <w:tcW w:type="dxa" w:w="3060"/>
-            <w:tcBorders>
-              <w:top w:val="single" w:color="BFBFBF" w:sz="2"/>
-              <w:left w:val="single" w:color="BFBFBF" w:sz="2"/>
-              <w:bottom w:val="single" w:color="BFBFBF" w:sz="2"/>
-              <w:right w:val="single" w:color="BFBFBF" w:sz="2"/>
-            </w:tcBorders>
-            <w:shd w:fill="FFFFFF" w:color="auto" w:val="clear"/>
-            <w:tcMar>
-              <w:top w:type="dxa" w:w="80"/>
-              <w:left w:type="dxa" w:w="120"/>
-              <w:bottom w:type="dxa" w:w="80"/>
-              <w:right w:type="dxa" w:w="120"/>
-            </w:tcMar>
-            <w:vAlign w:val="center"/>
-          </w:tcPr>
-          <w:p>
-            <w:pPr>
-              <w:widowControl/>
-              <w:spacing w:after="0" w:before="0" w:lineRule="auto"/>
-            </w:pPr>
-            <w:r>
-              <w:rPr>
-                <w:rFonts w:ascii="Calibri" w:cs="Calibri" w:eastAsia="Calibri" w:hAnsi="Calibri"/>
-                <w:b w:val="false"/>
-                <w:bCs w:val="false"/>
-                <w:i w:val="false"/>
-                <w:iCs w:val="false"/>
-                <w:color w:val="000000"/>
-                <w:sz w:val="20"/>
-                <w:szCs w:val="20"/>
-              </w:rPr>
-              <w:t xml:space="preserve">Register a new patient</w:t>
-            </w:r>
-          </w:p>
-        </w:tc>
-        <w:tc>
-          <w:tcPr>
-            <w:tcW w:type="dxa" w:w="3500"/>
-            <w:tcBorders>
-              <w:top w:val="single" w:color="BFBFBF" w:sz="2"/>
-              <w:left w:val="single" w:color="BFBFBF" w:sz="2"/>
-              <w:bottom w:val="single" w:color="BFBFBF" w:sz="2"/>
-              <w:right w:val="single" w:color="BFBFBF" w:sz="2"/>
-            </w:tcBorders>
-            <w:shd w:fill="FFFFFF" w:color="auto" w:val="clear"/>
-            <w:tcMar>
-              <w:top w:type="dxa" w:w="80"/>
-              <w:left w:type="dxa" w:w="120"/>
-              <w:bottom w:type="dxa" w:w="80"/>
-              <w:right w:type="dxa" w:w="120"/>
-            </w:tcMar>
-            <w:vAlign w:val="center"/>
-          </w:tcPr>
-          <w:p>
-            <w:pPr>
-              <w:widowControl/>
-              <w:spacing w:after="0" w:before="0" w:lineRule="auto"/>
-            </w:pPr>
-            <w:r>
-              <w:rPr>
-                <w:rFonts w:ascii="Calibri" w:cs="Calibri" w:eastAsia="Calibri" w:hAnsi="Calibri"/>
-                <w:b w:val="false"/>
-                <w:bCs w:val="false"/>
-                <w:i w:val="false"/>
-                <w:iCs w:val="false"/>
-                <w:color w:val="000000"/>
-                <w:sz w:val="20"/>
-                <w:szCs w:val="20"/>
-              </w:rPr>
-              <w:t xml:space="preserve">An MSF ID is generated: prefix IQ146-, at most 16 characters</w:t>
-            </w:r>
-          </w:p>
-        </w:tc>
-        <w:tc>
-          <w:tcPr>
-            <w:tcW w:type="dxa" w:w="1700"/>
-            <w:tcBorders>
-              <w:top w:val="single" w:color="BFBFBF" w:sz="2"/>
-              <w:left w:val="single" w:color="BFBFBF" w:sz="2"/>
-              <w:bottom w:val="single" w:color="BFBFBF" w:sz="2"/>
-              <w:right w:val="single" w:color="BFBFBF" w:sz="2"/>
-            </w:tcBorders>
-            <w:shd w:fill="FFFFFF" w:color="auto" w:val="clear"/>
-            <w:tcMar>
-              <w:top w:type="dxa" w:w="80"/>
-              <w:left w:type="dxa" w:w="120"/>
-              <w:bottom w:type="dxa" w:w="80"/>
-              <w:right w:type="dxa" w:w="120"/>
-            </w:tcMar>
-            <w:vAlign w:val="center"/>
-          </w:tcPr>
-          <w:p>
-            <w:pPr>
-              <w:widowControl/>
-              <w:spacing w:after="0" w:before="0" w:lineRule="auto"/>
-            </w:pPr>
-            <w:r>
-              <w:rPr>
-                <w:rFonts w:ascii="Calibri" w:cs="Calibri" w:eastAsia="Calibri" w:hAnsi="Calibri"/>
-                <w:b w:val="false"/>
-                <w:bCs w:val="false"/>
-                <w:i w:val="false"/>
-                <w:iCs w:val="false"/>
-                <w:color w:val="000000"/>
-                <w:sz w:val="20"/>
-                <w:szCs w:val="20"/>
-              </w:rPr>
-              <w:t xml:space="preserve">Registration Clerk</w:t>
+            <w:tcW w:type="dxa" w:w="1040"/>
+            <w:tcBorders>
+              <w:top w:val="single" w:color="BFBFBF" w:sz="2"/>
+              <w:left w:val="single" w:color="BFBFBF" w:sz="2"/>
+              <w:bottom w:val="single" w:color="BFBFBF" w:sz="2"/>
+              <w:right w:val="single" w:color="BFBFBF" w:sz="2"/>
+            </w:tcBorders>
+            <w:shd w:fill="FFFFFF" w:color="auto" w:val="clear"/>
+            <w:tcMar>
+              <w:top w:type="dxa" w:w="80"/>
+              <w:left w:type="dxa" w:w="120"/>
+              <w:bottom w:type="dxa" w:w="80"/>
+              <w:right w:type="dxa" w:w="120"/>
+            </w:tcMar>
+            <w:vAlign w:val="center"/>
+          </w:tcPr>
+          <w:p>
+            <w:pPr>
+              <w:widowControl/>
+              <w:spacing w:after="0" w:before="0" w:lineRule="auto"/>
+            </w:pPr>
+            <w:r>
+              <w:rPr>
+                <w:rFonts w:ascii="Calibri" w:cs="Calibri" w:eastAsia="Calibri" w:hAnsi="Calibri"/>
+                <w:b w:val="false"/>
+                <w:bCs w:val="false"/>
+                <w:i w:val="false"/>
+                <w:iCs w:val="false"/>
+                <w:color w:val="000000"/>
+                <w:sz w:val="20"/>
+                <w:szCs w:val="20"/>
+              </w:rPr>
+              <w:t xml:space="preserve">APPT-1</w:t>
+            </w:r>
+          </w:p>
+        </w:tc>
+        <w:tc>
+          <w:tcPr>
+            <w:tcW w:type="dxa" w:w="2300"/>
+            <w:tcBorders>
+              <w:top w:val="single" w:color="BFBFBF" w:sz="2"/>
+              <w:left w:val="single" w:color="BFBFBF" w:sz="2"/>
+              <w:bottom w:val="single" w:color="BFBFBF" w:sz="2"/>
+              <w:right w:val="single" w:color="BFBFBF" w:sz="2"/>
+            </w:tcBorders>
+            <w:shd w:fill="FFFFFF" w:color="auto" w:val="clear"/>
+            <w:tcMar>
+              <w:top w:type="dxa" w:w="80"/>
+              <w:left w:type="dxa" w:w="120"/>
+              <w:bottom w:type="dxa" w:w="80"/>
+              <w:right w:type="dxa" w:w="120"/>
+            </w:tcMar>
+            <w:vAlign w:val="center"/>
+          </w:tcPr>
+          <w:p>
+            <w:pPr>
+              <w:widowControl/>
+              <w:spacing w:after="0" w:before="0" w:lineRule="auto"/>
+            </w:pPr>
+            <w:r>
+              <w:rPr>
+                <w:rFonts w:ascii="Calibri" w:cs="Calibri" w:eastAsia="Calibri" w:hAnsi="Calibri"/>
+                <w:b w:val="false"/>
+                <w:bCs w:val="false"/>
+                <w:i w:val="false"/>
+                <w:iCs w:val="false"/>
+                <w:color w:val="000000"/>
+                <w:sz w:val="20"/>
+                <w:szCs w:val="20"/>
+              </w:rPr>
+              <w:t xml:space="preserve">Book a follow-up appointment</w:t>
+            </w:r>
+          </w:p>
+        </w:tc>
+        <w:tc>
+          <w:tcPr>
+            <w:tcW w:type="dxa" w:w="2700"/>
+            <w:tcBorders>
+              <w:top w:val="single" w:color="BFBFBF" w:sz="2"/>
+              <w:left w:val="single" w:color="BFBFBF" w:sz="2"/>
+              <w:bottom w:val="single" w:color="BFBFBF" w:sz="2"/>
+              <w:right w:val="single" w:color="BFBFBF" w:sz="2"/>
+            </w:tcBorders>
+            <w:shd w:fill="FFFFFF" w:color="auto" w:val="clear"/>
+            <w:tcMar>
+              <w:top w:type="dxa" w:w="80"/>
+              <w:left w:type="dxa" w:w="120"/>
+              <w:bottom w:type="dxa" w:w="80"/>
+              <w:right w:type="dxa" w:w="120"/>
+            </w:tcMar>
+            <w:vAlign w:val="center"/>
+          </w:tcPr>
+          <w:p>
+            <w:pPr>
+              <w:widowControl/>
+              <w:spacing w:after="0" w:before="0" w:lineRule="auto"/>
+            </w:pPr>
+            <w:r>
+              <w:rPr>
+                <w:rFonts w:ascii="Calibri" w:cs="Calibri" w:eastAsia="Calibri" w:hAnsi="Calibri"/>
+                <w:b w:val="false"/>
+                <w:bCs w:val="false"/>
+                <w:i w:val="false"/>
+                <w:iCs w:val="false"/>
+                <w:color w:val="000000"/>
+                <w:sz w:val="20"/>
+                <w:szCs w:val="20"/>
+              </w:rPr>
+              <w:t xml:space="preserve">One service per counselor: Mental Health - AB, DT, KA, SA, SK</w:t>
+            </w:r>
+          </w:p>
+        </w:tc>
+        <w:tc>
+          <w:tcPr>
+            <w:tcW w:type="dxa" w:w="1720"/>
+            <w:tcBorders>
+              <w:top w:val="single" w:color="BFBFBF" w:sz="2"/>
+              <w:left w:val="single" w:color="BFBFBF" w:sz="2"/>
+              <w:bottom w:val="single" w:color="BFBFBF" w:sz="2"/>
+              <w:right w:val="single" w:color="BFBFBF" w:sz="2"/>
+            </w:tcBorders>
+            <w:shd w:fill="FFFFFF" w:color="auto" w:val="clear"/>
+            <w:tcMar>
+              <w:top w:type="dxa" w:w="80"/>
+              <w:left w:type="dxa" w:w="120"/>
+              <w:bottom w:type="dxa" w:w="80"/>
+              <w:right w:type="dxa" w:w="120"/>
+            </w:tcMar>
+            <w:vAlign w:val="center"/>
+          </w:tcPr>
+          <w:p>
+            <w:pPr>
+              <w:widowControl/>
+              <w:spacing w:after="0" w:before="0" w:lineRule="auto"/>
+            </w:pPr>
+            <w:r>
+              <w:rPr>
+                <w:rFonts w:ascii="Calibri" w:cs="Calibri" w:eastAsia="Calibri" w:hAnsi="Calibri"/>
+                <w:b w:val="false"/>
+                <w:bCs w:val="false"/>
+                <w:i w:val="false"/>
+                <w:iCs w:val="false"/>
+                <w:color w:val="000000"/>
+                <w:sz w:val="20"/>
+                <w:szCs w:val="20"/>
+              </w:rPr>
+              <w:t xml:space="preserve">Registration Officer</w:t>
+            </w:r>
+          </w:p>
+        </w:tc>
+        <w:tc>
+          <w:tcPr>
+            <w:tcW w:type="dxa" w:w="1600"/>
+            <w:tcBorders>
+              <w:top w:val="single" w:color="BFBFBF" w:sz="2"/>
+              <w:left w:val="single" w:color="BFBFBF" w:sz="2"/>
+              <w:bottom w:val="single" w:color="BFBFBF" w:sz="2"/>
+              <w:right w:val="single" w:color="BFBFBF" w:sz="2"/>
+            </w:tcBorders>
+            <w:shd w:fill="FFFFFF" w:color="auto" w:val="clear"/>
+            <w:tcMar>
+              <w:top w:type="dxa" w:w="80"/>
+              <w:left w:type="dxa" w:w="120"/>
+              <w:bottom w:type="dxa" w:w="80"/>
+              <w:right w:type="dxa" w:w="120"/>
+            </w:tcMar>
+            <w:vAlign w:val="center"/>
+          </w:tcPr>
+          <w:p>
+            <w:pPr>
+              <w:widowControl/>
+              <w:spacing w:after="0" w:before="0" w:lineRule="auto"/>
+            </w:pPr>
+            <w:r>
+              <w:rPr>
+                <w:rFonts w:ascii="Calibri" w:cs="Calibri" w:eastAsia="Calibri" w:hAnsi="Calibri"/>
+                <w:b w:val="false"/>
+                <w:bCs w:val="false"/>
+                <w:i w:val="false"/>
+                <w:iCs w:val="false"/>
+                <w:color w:val="000000"/>
+                <w:sz w:val="20"/>
+                <w:szCs w:val="20"/>
+              </w:rPr>
+              <w:t xml:space="preserve">To test</w:t>
             </w:r>
           </w:p>
         </w:tc>
@@ -2089,153 +2343,191 @@
         </w:trPr>
         <w:tc>
           <w:tcPr>
-            <w:tcW w:type="dxa" w:w="1100"/>
-            <w:tcBorders>
-              <w:top w:val="single" w:color="BFBFBF" w:sz="2"/>
-              <w:left w:val="single" w:color="BFBFBF" w:sz="2"/>
-              <w:bottom w:val="single" w:color="BFBFBF" w:sz="2"/>
-              <w:right w:val="single" w:color="BFBFBF" w:sz="2"/>
-            </w:tcBorders>
-            <w:shd w:fill="FFFFFF" w:color="auto" w:val="clear"/>
-            <w:tcMar>
-              <w:top w:type="dxa" w:w="80"/>
-              <w:left w:type="dxa" w:w="120"/>
-              <w:bottom w:type="dxa" w:w="80"/>
-              <w:right w:type="dxa" w:w="120"/>
-            </w:tcMar>
-            <w:vAlign w:val="center"/>
-          </w:tcPr>
-          <w:p>
-            <w:pPr>
-              <w:widowControl/>
-              <w:spacing w:after="0" w:before="0" w:lineRule="auto"/>
-            </w:pPr>
-            <w:r>
-              <w:rPr>
-                <w:rFonts w:ascii="Calibri" w:cs="Calibri" w:eastAsia="Calibri" w:hAnsi="Calibri"/>
-                <w:b w:val="false"/>
-                <w:bCs w:val="false"/>
-                <w:i w:val="false"/>
-                <w:iCs w:val="false"/>
-                <w:color w:val="000000"/>
-                <w:sz w:val="20"/>
-                <w:szCs w:val="20"/>
-              </w:rPr>
-              <w:t xml:space="preserve">VISIT-1</w:t>
-            </w:r>
-          </w:p>
-        </w:tc>
-        <w:tc>
-          <w:tcPr>
-            <w:tcW w:type="dxa" w:w="3060"/>
-            <w:tcBorders>
-              <w:top w:val="single" w:color="BFBFBF" w:sz="2"/>
-              <w:left w:val="single" w:color="BFBFBF" w:sz="2"/>
-              <w:bottom w:val="single" w:color="BFBFBF" w:sz="2"/>
-              <w:right w:val="single" w:color="BFBFBF" w:sz="2"/>
-            </w:tcBorders>
-            <w:shd w:fill="FFFFFF" w:color="auto" w:val="clear"/>
-            <w:tcMar>
-              <w:top w:type="dxa" w:w="80"/>
-              <w:left w:type="dxa" w:w="120"/>
-              <w:bottom w:type="dxa" w:w="80"/>
-              <w:right w:type="dxa" w:w="120"/>
-            </w:tcMar>
-            <w:vAlign w:val="center"/>
-          </w:tcPr>
-          <w:p>
-            <w:pPr>
-              <w:widowControl/>
-              <w:spacing w:after="0" w:before="0" w:lineRule="auto"/>
-            </w:pPr>
-            <w:r>
-              <w:rPr>
-                <w:rFonts w:ascii="Calibri" w:cs="Calibri" w:eastAsia="Calibri" w:hAnsi="Calibri"/>
-                <w:b w:val="false"/>
-                <w:bCs w:val="false"/>
-                <w:i w:val="false"/>
-                <w:iCs w:val="false"/>
-                <w:color w:val="000000"/>
-                <w:sz w:val="20"/>
-                <w:szCs w:val="20"/>
-              </w:rPr>
-              <w:t xml:space="preserve">Start a visit</w:t>
-            </w:r>
-          </w:p>
-        </w:tc>
-        <w:tc>
-          <w:tcPr>
-            <w:tcW w:type="dxa" w:w="3500"/>
-            <w:tcBorders>
-              <w:top w:val="single" w:color="BFBFBF" w:sz="2"/>
-              <w:left w:val="single" w:color="BFBFBF" w:sz="2"/>
-              <w:bottom w:val="single" w:color="BFBFBF" w:sz="2"/>
-              <w:right w:val="single" w:color="BFBFBF" w:sz="2"/>
-            </w:tcBorders>
-            <w:shd w:fill="FFFFFF" w:color="auto" w:val="clear"/>
-            <w:tcMar>
-              <w:top w:type="dxa" w:w="80"/>
-              <w:left w:type="dxa" w:w="120"/>
-              <w:bottom w:type="dxa" w:w="80"/>
-              <w:right w:type="dxa" w:w="120"/>
-            </w:tcMar>
-            <w:vAlign w:val="center"/>
-          </w:tcPr>
-          <w:p>
-            <w:pPr>
-              <w:widowControl/>
-              <w:spacing w:after="0" w:before="0" w:lineRule="auto"/>
-            </w:pPr>
-            <w:r>
-              <w:rPr>
-                <w:rFonts w:ascii="Calibri" w:cs="Calibri" w:eastAsia="Calibri" w:hAnsi="Calibri"/>
-                <w:b w:val="false"/>
-                <w:bCs w:val="false"/>
-                <w:i w:val="false"/>
-                <w:iCs w:val="false"/>
-                <w:color w:val="000000"/>
-                <w:sz w:val="20"/>
-                <w:szCs w:val="20"/>
-              </w:rPr>
-              <w:t xml:space="preserve">Visit types offered: OPD, ER, IPD, Telehealth</w:t>
-            </w:r>
-          </w:p>
-        </w:tc>
-        <w:tc>
-          <w:tcPr>
-            <w:tcW w:type="dxa" w:w="1700"/>
-            <w:tcBorders>
-              <w:top w:val="single" w:color="BFBFBF" w:sz="2"/>
-              <w:left w:val="single" w:color="BFBFBF" w:sz="2"/>
-              <w:bottom w:val="single" w:color="BFBFBF" w:sz="2"/>
-              <w:right w:val="single" w:color="BFBFBF" w:sz="2"/>
-            </w:tcBorders>
-            <w:shd w:fill="FFFFFF" w:color="auto" w:val="clear"/>
-            <w:tcMar>
-              <w:top w:type="dxa" w:w="80"/>
-              <w:left w:type="dxa" w:w="120"/>
-              <w:bottom w:type="dxa" w:w="80"/>
-              <w:right w:type="dxa" w:w="120"/>
-            </w:tcMar>
-            <w:vAlign w:val="center"/>
-          </w:tcPr>
-          <w:p>
-            <w:pPr>
-              <w:widowControl/>
-              <w:spacing w:after="0" w:before="0" w:lineRule="auto"/>
-            </w:pPr>
-            <w:r>
-              <w:rPr>
-                <w:rFonts w:ascii="Calibri" w:cs="Calibri" w:eastAsia="Calibri" w:hAnsi="Calibri"/>
-                <w:b w:val="false"/>
-                <w:bCs w:val="false"/>
-                <w:i w:val="false"/>
-                <w:iCs w:val="false"/>
-                <w:color w:val="000000"/>
-                <w:sz w:val="20"/>
-                <w:szCs w:val="20"/>
-              </w:rPr>
-              <w:t xml:space="preserve">MH psychologist</w:t>
+            <w:tcW w:type="dxa" w:w="1040"/>
+            <w:tcBorders>
+              <w:top w:val="single" w:color="BFBFBF" w:sz="2"/>
+              <w:left w:val="single" w:color="BFBFBF" w:sz="2"/>
+              <w:bottom w:val="single" w:color="BFBFBF" w:sz="2"/>
+              <w:right w:val="single" w:color="BFBFBF" w:sz="2"/>
+            </w:tcBorders>
+            <w:shd w:fill="FFFFFF" w:color="auto" w:val="clear"/>
+            <w:tcMar>
+              <w:top w:type="dxa" w:w="80"/>
+              <w:left w:type="dxa" w:w="120"/>
+              <w:bottom w:type="dxa" w:w="80"/>
+              <w:right w:type="dxa" w:w="120"/>
+            </w:tcMar>
+            <w:vAlign w:val="center"/>
+          </w:tcPr>
+          <w:p>
+            <w:pPr>
+              <w:widowControl/>
+              <w:spacing w:after="0" w:before="0" w:lineRule="auto"/>
+            </w:pPr>
+            <w:r>
+              <w:rPr>
+                <w:rFonts w:ascii="Calibri" w:cs="Calibri" w:eastAsia="Calibri" w:hAnsi="Calibri"/>
+                <w:b w:val="false"/>
+                <w:bCs w:val="false"/>
+                <w:i w:val="false"/>
+                <w:iCs w:val="false"/>
+                <w:color w:val="000000"/>
+                <w:sz w:val="20"/>
+                <w:szCs w:val="20"/>
+              </w:rPr>
+              <w:t xml:space="preserve">REG-1</w:t>
+            </w:r>
+          </w:p>
+        </w:tc>
+        <w:tc>
+          <w:tcPr>
+            <w:tcW w:type="dxa" w:w="2300"/>
+            <w:tcBorders>
+              <w:top w:val="single" w:color="BFBFBF" w:sz="2"/>
+              <w:left w:val="single" w:color="BFBFBF" w:sz="2"/>
+              <w:bottom w:val="single" w:color="BFBFBF" w:sz="2"/>
+              <w:right w:val="single" w:color="BFBFBF" w:sz="2"/>
+            </w:tcBorders>
+            <w:shd w:fill="FFFFFF" w:color="auto" w:val="clear"/>
+            <w:tcMar>
+              <w:top w:type="dxa" w:w="80"/>
+              <w:left w:type="dxa" w:w="120"/>
+              <w:bottom w:type="dxa" w:w="80"/>
+              <w:right w:type="dxa" w:w="120"/>
+            </w:tcMar>
+            <w:vAlign w:val="center"/>
+          </w:tcPr>
+          <w:p>
+            <w:pPr>
+              <w:widowControl/>
+              <w:spacing w:after="0" w:before="0" w:lineRule="auto"/>
+            </w:pPr>
+            <w:r>
+              <w:rPr>
+                <w:rFonts w:ascii="Calibri" w:cs="Calibri" w:eastAsia="Calibri" w:hAnsi="Calibri"/>
+                <w:b w:val="false"/>
+                <w:bCs w:val="false"/>
+                <w:i w:val="false"/>
+                <w:iCs w:val="false"/>
+                <w:color w:val="000000"/>
+                <w:sz w:val="20"/>
+                <w:szCs w:val="20"/>
+              </w:rPr>
+              <w:t xml:space="preserve">Register a new patient</w:t>
+            </w:r>
+          </w:p>
+        </w:tc>
+        <w:tc>
+          <w:tcPr>
+            <w:tcW w:type="dxa" w:w="2700"/>
+            <w:tcBorders>
+              <w:top w:val="single" w:color="BFBFBF" w:sz="2"/>
+              <w:left w:val="single" w:color="BFBFBF" w:sz="2"/>
+              <w:bottom w:val="single" w:color="BFBFBF" w:sz="2"/>
+              <w:right w:val="single" w:color="BFBFBF" w:sz="2"/>
+            </w:tcBorders>
+            <w:shd w:fill="FFFFFF" w:color="auto" w:val="clear"/>
+            <w:tcMar>
+              <w:top w:type="dxa" w:w="80"/>
+              <w:left w:type="dxa" w:w="120"/>
+              <w:bottom w:type="dxa" w:w="80"/>
+              <w:right w:type="dxa" w:w="120"/>
+            </w:tcMar>
+            <w:vAlign w:val="center"/>
+          </w:tcPr>
+          <w:p>
+            <w:pPr>
+              <w:widowControl/>
+              <w:spacing w:after="0" w:before="0" w:lineRule="auto"/>
+            </w:pPr>
+            <w:r>
+              <w:rPr>
+                <w:rFonts w:ascii="Calibri" w:cs="Calibri" w:eastAsia="Calibri" w:hAnsi="Calibri"/>
+                <w:b w:val="false"/>
+                <w:bCs w:val="false"/>
+                <w:i w:val="false"/>
+                <w:iCs w:val="false"/>
+                <w:color w:val="000000"/>
+                <w:sz w:val="20"/>
+                <w:szCs w:val="20"/>
+              </w:rPr>
+              <w:t xml:space="preserve">An MSF ID is generated automatically: prefix IQ146-, at most 16 characters</w:t>
+            </w:r>
+          </w:p>
+        </w:tc>
+        <w:tc>
+          <w:tcPr>
+            <w:tcW w:type="dxa" w:w="1720"/>
+            <w:tcBorders>
+              <w:top w:val="single" w:color="BFBFBF" w:sz="2"/>
+              <w:left w:val="single" w:color="BFBFBF" w:sz="2"/>
+              <w:bottom w:val="single" w:color="BFBFBF" w:sz="2"/>
+              <w:right w:val="single" w:color="BFBFBF" w:sz="2"/>
+            </w:tcBorders>
+            <w:shd w:fill="FFFFFF" w:color="auto" w:val="clear"/>
+            <w:tcMar>
+              <w:top w:type="dxa" w:w="80"/>
+              <w:left w:type="dxa" w:w="120"/>
+              <w:bottom w:type="dxa" w:w="80"/>
+              <w:right w:type="dxa" w:w="120"/>
+            </w:tcMar>
+            <w:vAlign w:val="center"/>
+          </w:tcPr>
+          <w:p>
+            <w:pPr>
+              <w:widowControl/>
+              <w:spacing w:after="0" w:before="0" w:lineRule="auto"/>
+            </w:pPr>
+            <w:r>
+              <w:rPr>
+                <w:rFonts w:ascii="Calibri" w:cs="Calibri" w:eastAsia="Calibri" w:hAnsi="Calibri"/>
+                <w:b w:val="false"/>
+                <w:bCs w:val="false"/>
+                <w:i w:val="false"/>
+                <w:iCs w:val="false"/>
+                <w:color w:val="000000"/>
+                <w:sz w:val="20"/>
+                <w:szCs w:val="20"/>
+              </w:rPr>
+              <w:t xml:space="preserve">Registration Officer</w:t>
+            </w:r>
+          </w:p>
+        </w:tc>
+        <w:tc>
+          <w:tcPr>
+            <w:tcW w:type="dxa" w:w="1600"/>
+            <w:tcBorders>
+              <w:top w:val="single" w:color="BFBFBF" w:sz="2"/>
+              <w:left w:val="single" w:color="BFBFBF" w:sz="2"/>
+              <w:bottom w:val="single" w:color="BFBFBF" w:sz="2"/>
+              <w:right w:val="single" w:color="BFBFBF" w:sz="2"/>
+            </w:tcBorders>
+            <w:shd w:fill="FFFFFF" w:color="auto" w:val="clear"/>
+            <w:tcMar>
+              <w:top w:type="dxa" w:w="80"/>
+              <w:left w:type="dxa" w:w="120"/>
+              <w:bottom w:type="dxa" w:w="80"/>
+              <w:right w:type="dxa" w:w="120"/>
+            </w:tcMar>
+            <w:vAlign w:val="center"/>
+          </w:tcPr>
+          <w:p>
+            <w:pPr>
+              <w:widowControl/>
+              <w:spacing w:after="0" w:before="0" w:lineRule="auto"/>
+            </w:pPr>
+            <w:r>
+              <w:rPr>
+                <w:rFonts w:ascii="Calibri" w:cs="Calibri" w:eastAsia="Calibri" w:hAnsi="Calibri"/>
+                <w:b w:val="false"/>
+                <w:bCs w:val="false"/>
+                <w:i w:val="false"/>
+                <w:iCs w:val="false"/>
+                <w:color w:val="000000"/>
+                <w:sz w:val="20"/>
+                <w:szCs w:val="20"/>
+              </w:rPr>
+              <w:t xml:space="preserve">✅ Config matches</w:t>
             </w:r>
           </w:p>
         </w:tc>
@@ -2246,7 +2538,7 @@
         </w:trPr>
         <w:tc>
           <w:tcPr>
-            <w:tcW w:type="dxa" w:w="1100"/>
+            <w:tcW w:type="dxa" w:w="1040"/>
             <w:tcBorders>
               <w:top w:val="single" w:color="BFBFBF" w:sz="2"/>
               <w:left w:val="single" w:color="BFBFBF" w:sz="2"/>
@@ -2284,115 +2576,153 @@
         </w:tc>
         <w:tc>
           <w:tcPr>
-            <w:tcW w:type="dxa" w:w="3060"/>
-            <w:tcBorders>
-              <w:top w:val="single" w:color="BFBFBF" w:sz="2"/>
-              <w:left w:val="single" w:color="BFBFBF" w:sz="2"/>
-              <w:bottom w:val="single" w:color="BFBFBF" w:sz="2"/>
-              <w:right w:val="single" w:color="BFBFBF" w:sz="2"/>
-            </w:tcBorders>
-            <w:shd w:fill="FFFFFF" w:color="auto" w:val="clear"/>
-            <w:tcMar>
-              <w:top w:type="dxa" w:w="80"/>
-              <w:left w:type="dxa" w:w="120"/>
-              <w:bottom w:type="dxa" w:w="80"/>
-              <w:right w:type="dxa" w:w="120"/>
-            </w:tcMar>
-            <w:vAlign w:val="center"/>
-          </w:tcPr>
-          <w:p>
-            <w:pPr>
-              <w:widowControl/>
-              <w:spacing w:after="0" w:before="0" w:lineRule="auto"/>
-            </w:pPr>
-            <w:r>
-              <w:rPr>
-                <w:rFonts w:ascii="Calibri" w:cs="Calibri" w:eastAsia="Calibri" w:hAnsi="Calibri"/>
-                <w:b w:val="false"/>
-                <w:bCs w:val="false"/>
-                <w:i w:val="false"/>
-                <w:iCs w:val="false"/>
-                <w:color w:val="000000"/>
-                <w:sz w:val="20"/>
-                <w:szCs w:val="20"/>
-              </w:rPr>
-              <w:t xml:space="preserve">Save an F17 form, wait for the next DHIS2 sync</w:t>
-            </w:r>
-          </w:p>
-        </w:tc>
-        <w:tc>
-          <w:tcPr>
-            <w:tcW w:type="dxa" w:w="3500"/>
-            <w:tcBorders>
-              <w:top w:val="single" w:color="BFBFBF" w:sz="2"/>
-              <w:left w:val="single" w:color="BFBFBF" w:sz="2"/>
-              <w:bottom w:val="single" w:color="BFBFBF" w:sz="2"/>
-              <w:right w:val="single" w:color="BFBFBF" w:sz="2"/>
-            </w:tcBorders>
-            <w:shd w:fill="FFFFFF" w:color="auto" w:val="clear"/>
-            <w:tcMar>
-              <w:top w:type="dxa" w:w="80"/>
-              <w:left w:type="dxa" w:w="120"/>
-              <w:bottom w:type="dxa" w:w="80"/>
-              <w:right w:type="dxa" w:w="120"/>
-            </w:tcMar>
-            <w:vAlign w:val="center"/>
-          </w:tcPr>
-          <w:p>
-            <w:pPr>
-              <w:widowControl/>
-              <w:spacing w:after="0" w:before="0" w:lineRule="auto"/>
-            </w:pPr>
-            <w:r>
-              <w:rPr>
-                <w:rFonts w:ascii="Calibri" w:cs="Calibri" w:eastAsia="Calibri" w:hAnsi="Calibri"/>
-                <w:b w:val="false"/>
-                <w:bCs w:val="false"/>
-                <w:i w:val="false"/>
-                <w:iCs w:val="false"/>
-                <w:color w:val="000000"/>
-                <w:sz w:val="20"/>
-                <w:szCs w:val="20"/>
-              </w:rPr>
-              <w:t xml:space="preserve">The admission appears in DHIS2 with the right date</w:t>
-            </w:r>
-          </w:p>
-        </w:tc>
-        <w:tc>
-          <w:tcPr>
-            <w:tcW w:type="dxa" w:w="1700"/>
-            <w:tcBorders>
-              <w:top w:val="single" w:color="BFBFBF" w:sz="2"/>
-              <w:left w:val="single" w:color="BFBFBF" w:sz="2"/>
-              <w:bottom w:val="single" w:color="BFBFBF" w:sz="2"/>
-              <w:right w:val="single" w:color="BFBFBF" w:sz="2"/>
-            </w:tcBorders>
-            <w:shd w:fill="FFFFFF" w:color="auto" w:val="clear"/>
-            <w:tcMar>
-              <w:top w:type="dxa" w:w="80"/>
-              <w:left w:type="dxa" w:w="120"/>
-              <w:bottom w:type="dxa" w:w="80"/>
-              <w:right w:type="dxa" w:w="120"/>
-            </w:tcMar>
-            <w:vAlign w:val="center"/>
-          </w:tcPr>
-          <w:p>
-            <w:pPr>
-              <w:widowControl/>
-              <w:spacing w:after="0" w:before="0" w:lineRule="auto"/>
-            </w:pPr>
-            <w:r>
-              <w:rPr>
-                <w:rFonts w:ascii="Calibri" w:cs="Calibri" w:eastAsia="Calibri" w:hAnsi="Calibri"/>
-                <w:b w:val="false"/>
-                <w:bCs w:val="false"/>
-                <w:i w:val="false"/>
-                <w:iCs w:val="false"/>
-                <w:color w:val="000000"/>
-                <w:sz w:val="20"/>
-                <w:szCs w:val="20"/>
-              </w:rPr>
-              <w:t xml:space="preserve">Data officer</w:t>
+            <w:tcW w:type="dxa" w:w="2300"/>
+            <w:tcBorders>
+              <w:top w:val="single" w:color="BFBFBF" w:sz="2"/>
+              <w:left w:val="single" w:color="BFBFBF" w:sz="2"/>
+              <w:bottom w:val="single" w:color="BFBFBF" w:sz="2"/>
+              <w:right w:val="single" w:color="BFBFBF" w:sz="2"/>
+            </w:tcBorders>
+            <w:shd w:fill="FFFFFF" w:color="auto" w:val="clear"/>
+            <w:tcMar>
+              <w:top w:type="dxa" w:w="80"/>
+              <w:left w:type="dxa" w:w="120"/>
+              <w:bottom w:type="dxa" w:w="80"/>
+              <w:right w:type="dxa" w:w="120"/>
+            </w:tcMar>
+            <w:vAlign w:val="center"/>
+          </w:tcPr>
+          <w:p>
+            <w:pPr>
+              <w:widowControl/>
+              <w:spacing w:after="0" w:before="0" w:lineRule="auto"/>
+            </w:pPr>
+            <w:r>
+              <w:rPr>
+                <w:rFonts w:ascii="Calibri" w:cs="Calibri" w:eastAsia="Calibri" w:hAnsi="Calibri"/>
+                <w:b w:val="false"/>
+                <w:bCs w:val="false"/>
+                <w:i w:val="false"/>
+                <w:iCs w:val="false"/>
+                <w:color w:val="000000"/>
+                <w:sz w:val="20"/>
+                <w:szCs w:val="20"/>
+              </w:rPr>
+              <w:t xml:space="preserve">Save an F35 PHQ-9, wait for the daily DHIS2 sync</w:t>
+            </w:r>
+          </w:p>
+        </w:tc>
+        <w:tc>
+          <w:tcPr>
+            <w:tcW w:type="dxa" w:w="2700"/>
+            <w:tcBorders>
+              <w:top w:val="single" w:color="BFBFBF" w:sz="2"/>
+              <w:left w:val="single" w:color="BFBFBF" w:sz="2"/>
+              <w:bottom w:val="single" w:color="BFBFBF" w:sz="2"/>
+              <w:right w:val="single" w:color="BFBFBF" w:sz="2"/>
+            </w:tcBorders>
+            <w:shd w:fill="FFFFFF" w:color="auto" w:val="clear"/>
+            <w:tcMar>
+              <w:top w:type="dxa" w:w="80"/>
+              <w:left w:type="dxa" w:w="120"/>
+              <w:bottom w:type="dxa" w:w="80"/>
+              <w:right w:type="dxa" w:w="120"/>
+            </w:tcMar>
+            <w:vAlign w:val="center"/>
+          </w:tcPr>
+          <w:p>
+            <w:pPr>
+              <w:widowControl/>
+              <w:spacing w:after="0" w:before="0" w:lineRule="auto"/>
+            </w:pPr>
+            <w:r>
+              <w:rPr>
+                <w:rFonts w:ascii="Calibri" w:cs="Calibri" w:eastAsia="Calibri" w:hAnsi="Calibri"/>
+                <w:b w:val="false"/>
+                <w:bCs w:val="false"/>
+                <w:i w:val="false"/>
+                <w:iCs w:val="false"/>
+                <w:color w:val="000000"/>
+                <w:sz w:val="20"/>
+                <w:szCs w:val="20"/>
+              </w:rPr>
+              <w:t xml:space="preserve">The PHQ-9 score appears in DHIS2 for that patient</w:t>
+            </w:r>
+          </w:p>
+        </w:tc>
+        <w:tc>
+          <w:tcPr>
+            <w:tcW w:type="dxa" w:w="1720"/>
+            <w:tcBorders>
+              <w:top w:val="single" w:color="BFBFBF" w:sz="2"/>
+              <w:left w:val="single" w:color="BFBFBF" w:sz="2"/>
+              <w:bottom w:val="single" w:color="BFBFBF" w:sz="2"/>
+              <w:right w:val="single" w:color="BFBFBF" w:sz="2"/>
+            </w:tcBorders>
+            <w:shd w:fill="FFFFFF" w:color="auto" w:val="clear"/>
+            <w:tcMar>
+              <w:top w:type="dxa" w:w="80"/>
+              <w:left w:type="dxa" w:w="120"/>
+              <w:bottom w:type="dxa" w:w="80"/>
+              <w:right w:type="dxa" w:w="120"/>
+            </w:tcMar>
+            <w:vAlign w:val="center"/>
+          </w:tcPr>
+          <w:p>
+            <w:pPr>
+              <w:widowControl/>
+              <w:spacing w:after="0" w:before="0" w:lineRule="auto"/>
+            </w:pPr>
+            <w:r>
+              <w:rPr>
+                <w:rFonts w:ascii="Calibri" w:cs="Calibri" w:eastAsia="Calibri" w:hAnsi="Calibri"/>
+                <w:b w:val="false"/>
+                <w:bCs w:val="false"/>
+                <w:i w:val="false"/>
+                <w:iCs w:val="false"/>
+                <w:color w:val="000000"/>
+                <w:sz w:val="20"/>
+                <w:szCs w:val="20"/>
+              </w:rPr>
+              <w:t xml:space="preserve">Automatic (daily sync)</w:t>
+            </w:r>
+          </w:p>
+        </w:tc>
+        <w:tc>
+          <w:tcPr>
+            <w:tcW w:type="dxa" w:w="1600"/>
+            <w:tcBorders>
+              <w:top w:val="single" w:color="BFBFBF" w:sz="2"/>
+              <w:left w:val="single" w:color="BFBFBF" w:sz="2"/>
+              <w:bottom w:val="single" w:color="BFBFBF" w:sz="2"/>
+              <w:right w:val="single" w:color="BFBFBF" w:sz="2"/>
+            </w:tcBorders>
+            <w:shd w:fill="FFFFFF" w:color="auto" w:val="clear"/>
+            <w:tcMar>
+              <w:top w:type="dxa" w:w="80"/>
+              <w:left w:type="dxa" w:w="120"/>
+              <w:bottom w:type="dxa" w:w="80"/>
+              <w:right w:type="dxa" w:w="120"/>
+            </w:tcMar>
+            <w:vAlign w:val="center"/>
+          </w:tcPr>
+          <w:p>
+            <w:pPr>
+              <w:widowControl/>
+              <w:spacing w:after="0" w:before="0" w:lineRule="auto"/>
+            </w:pPr>
+            <w:r>
+              <w:rPr>
+                <w:rFonts w:ascii="Calibri" w:cs="Calibri" w:eastAsia="Calibri" w:hAnsi="Calibri"/>
+                <w:b w:val="false"/>
+                <w:bCs w:val="false"/>
+                <w:i w:val="false"/>
+                <w:iCs w:val="false"/>
+                <w:color w:val="000000"/>
+                <w:sz w:val="20"/>
+                <w:szCs w:val="20"/>
+              </w:rPr>
+              <w:t xml:space="preserve">To test</w:t>
             </w:r>
           </w:p>
         </w:tc>
@@ -2400,28 +2730,8 @@
     </w:tbl>
     <w:p>
       <w:pPr>
-        <w:spacing w:after="80" w:before="0" w:lineRule="auto"/>
-      </w:pPr>
-    </w:p>
-    <w:p>
-      <w:pPr>
-        <w:widowControl/>
-        <w:spacing w:after="200" w:before="0" w:line="276" w:lineRule="auto"/>
-        <w:jc w:val="both"/>
-      </w:pPr>
-      <w:r>
-        <w:rPr>
-          <w:rFonts w:ascii="Calibri" w:cs="Calibri" w:eastAsia="Calibri" w:hAnsi="Calibri"/>
-          <w:b w:val="false"/>
-          <w:bCs w:val="false"/>
-          <w:i/>
-          <w:iCs/>
-          <w:color w:val="5F6D6A"/>
-          <w:sz w:val="20"/>
-          <w:szCs w:val="20"/>
-        </w:rPr>
-        <w:t xml:space="preserve">ROLES examples come from the User roles and privileges tab: each « x » means the role can, each empty cell means it cannot, and both are tested. REG-1 comes from the Patient Identifiers tab. DHIS2-1 is illustrative.</w:t>
-      </w:r>
+        <w:spacing w:after="60" w:before="0" w:lineRule="auto"/>
+      </w:pPr>
     </w:p>
     <w:p>
       <w:pPr>
@@ -2444,353 +2754,6 @@
         </w:rPr>
         <w:t xml:space="preserve">Writing a good test</w:t>
       </w:r>
-    </w:p>
-    <w:tbl>
-      <w:tblPr>
-        <w:tblW w:type="dxa" w:w="9360"/>
-        <w:tblBorders>
-          <w:top w:val="single" w:color="auto" w:sz="4"/>
-          <w:left w:val="single" w:color="auto" w:sz="4"/>
-          <w:bottom w:val="single" w:color="auto" w:sz="4"/>
-          <w:right w:val="single" w:color="auto" w:sz="4"/>
-          <w:insideH w:val="single" w:color="auto" w:sz="4"/>
-          <w:insideV w:val="single" w:color="auto" w:sz="4"/>
-        </w:tblBorders>
-      </w:tblPr>
-      <w:tblGrid>
-        <w:gridCol w:w="4680"/>
-        <w:gridCol w:w="4680"/>
-      </w:tblGrid>
-      <w:tr>
-        <w:trPr>
-          <w:cantSplit/>
-          <w:tblHeader/>
-        </w:trPr>
-        <w:tc>
-          <w:tcPr>
-            <w:tcW w:type="dxa" w:w="4680"/>
-            <w:tcBorders>
-              <w:top w:val="single" w:color="BFBFBF" w:sz="2"/>
-              <w:left w:val="single" w:color="BFBFBF" w:sz="2"/>
-              <w:bottom w:val="single" w:color="BFBFBF" w:sz="2"/>
-              <w:right w:val="single" w:color="BFBFBF" w:sz="2"/>
-            </w:tcBorders>
-            <w:shd w:fill="E7E6E6" w:color="auto" w:val="clear"/>
-            <w:tcMar>
-              <w:top w:type="dxa" w:w="80"/>
-              <w:left w:type="dxa" w:w="120"/>
-              <w:bottom w:type="dxa" w:w="80"/>
-              <w:right w:type="dxa" w:w="120"/>
-            </w:tcMar>
-            <w:vAlign w:val="center"/>
-          </w:tcPr>
-          <w:p>
-            <w:pPr>
-              <w:widowControl/>
-              <w:spacing w:after="0" w:before="0" w:lineRule="auto"/>
-            </w:pPr>
-            <w:r>
-              <w:rPr>
-                <w:rFonts w:ascii="Calibri" w:cs="Calibri" w:eastAsia="Calibri" w:hAnsi="Calibri"/>
-                <w:b/>
-                <w:bCs/>
-                <w:i w:val="false"/>
-                <w:iCs w:val="false"/>
-                <w:color w:val="000000"/>
-                <w:sz w:val="20"/>
-                <w:szCs w:val="20"/>
-              </w:rPr>
-              <w:t xml:space="preserve">Testable</w:t>
-            </w:r>
-          </w:p>
-        </w:tc>
-        <w:tc>
-          <w:tcPr>
-            <w:tcW w:type="dxa" w:w="4680"/>
-            <w:tcBorders>
-              <w:top w:val="single" w:color="BFBFBF" w:sz="2"/>
-              <w:left w:val="single" w:color="BFBFBF" w:sz="2"/>
-              <w:bottom w:val="single" w:color="BFBFBF" w:sz="2"/>
-              <w:right w:val="single" w:color="BFBFBF" w:sz="2"/>
-            </w:tcBorders>
-            <w:shd w:fill="E7E6E6" w:color="auto" w:val="clear"/>
-            <w:tcMar>
-              <w:top w:type="dxa" w:w="80"/>
-              <w:left w:type="dxa" w:w="120"/>
-              <w:bottom w:type="dxa" w:w="80"/>
-              <w:right w:type="dxa" w:w="120"/>
-            </w:tcMar>
-            <w:vAlign w:val="center"/>
-          </w:tcPr>
-          <w:p>
-            <w:pPr>
-              <w:widowControl/>
-              <w:spacing w:after="0" w:before="0" w:lineRule="auto"/>
-            </w:pPr>
-            <w:r>
-              <w:rPr>
-                <w:rFonts w:ascii="Calibri" w:cs="Calibri" w:eastAsia="Calibri" w:hAnsi="Calibri"/>
-                <w:b/>
-                <w:bCs/>
-                <w:i w:val="false"/>
-                <w:iCs w:val="false"/>
-                <w:color w:val="000000"/>
-                <w:sz w:val="20"/>
-                <w:szCs w:val="20"/>
-              </w:rPr>
-              <w:t xml:space="preserve">Not testable</w:t>
-            </w:r>
-          </w:p>
-        </w:tc>
-      </w:tr>
-      <w:tr>
-        <w:trPr>
-          <w:cantSplit/>
-        </w:trPr>
-        <w:tc>
-          <w:tcPr>
-            <w:tcW w:type="dxa" w:w="4680"/>
-            <w:tcBorders>
-              <w:top w:val="single" w:color="BFBFBF" w:sz="2"/>
-              <w:left w:val="single" w:color="BFBFBF" w:sz="2"/>
-              <w:bottom w:val="single" w:color="BFBFBF" w:sz="2"/>
-              <w:right w:val="single" w:color="BFBFBF" w:sz="2"/>
-            </w:tcBorders>
-            <w:shd w:fill="FFFFFF" w:color="auto" w:val="clear"/>
-            <w:tcMar>
-              <w:top w:type="dxa" w:w="80"/>
-              <w:left w:type="dxa" w:w="120"/>
-              <w:bottom w:type="dxa" w:w="80"/>
-              <w:right w:type="dxa" w:w="120"/>
-            </w:tcMar>
-            <w:vAlign w:val="center"/>
-          </w:tcPr>
-          <w:p>
-            <w:pPr>
-              <w:widowControl/>
-              <w:spacing w:after="0" w:before="0" w:lineRule="auto"/>
-            </w:pPr>
-            <w:r>
-              <w:rPr>
-                <w:rFonts w:ascii="Calibri" w:cs="Calibri" w:eastAsia="Calibri" w:hAnsi="Calibri"/>
-                <w:b w:val="false"/>
-                <w:bCs w:val="false"/>
-                <w:i w:val="false"/>
-                <w:iCs w:val="false"/>
-                <w:color w:val="000000"/>
-                <w:sz w:val="20"/>
-                <w:szCs w:val="20"/>
-              </w:rPr>
-              <w:t xml:space="preserve">PHQ-9 score = 27</w:t>
-            </w:r>
-          </w:p>
-        </w:tc>
-        <w:tc>
-          <w:tcPr>
-            <w:tcW w:type="dxa" w:w="4680"/>
-            <w:tcBorders>
-              <w:top w:val="single" w:color="BFBFBF" w:sz="2"/>
-              <w:left w:val="single" w:color="BFBFBF" w:sz="2"/>
-              <w:bottom w:val="single" w:color="BFBFBF" w:sz="2"/>
-              <w:right w:val="single" w:color="BFBFBF" w:sz="2"/>
-            </w:tcBorders>
-            <w:shd w:fill="FFFFFF" w:color="auto" w:val="clear"/>
-            <w:tcMar>
-              <w:top w:type="dxa" w:w="80"/>
-              <w:left w:type="dxa" w:w="120"/>
-              <w:bottom w:type="dxa" w:w="80"/>
-              <w:right w:type="dxa" w:w="120"/>
-            </w:tcMar>
-            <w:vAlign w:val="center"/>
-          </w:tcPr>
-          <w:p>
-            <w:pPr>
-              <w:widowControl/>
-              <w:spacing w:after="0" w:before="0" w:lineRule="auto"/>
-            </w:pPr>
-            <w:r>
-              <w:rPr>
-                <w:rFonts w:ascii="Calibri" w:cs="Calibri" w:eastAsia="Calibri" w:hAnsi="Calibri"/>
-                <w:b w:val="false"/>
-                <w:bCs w:val="false"/>
-                <w:i w:val="false"/>
-                <w:iCs w:val="false"/>
-                <w:color w:val="000000"/>
-                <w:sz w:val="20"/>
-                <w:szCs w:val="20"/>
-              </w:rPr>
-              <w:t xml:space="preserve">The score is correct</w:t>
-            </w:r>
-          </w:p>
-        </w:tc>
-      </w:tr>
-      <w:tr>
-        <w:trPr>
-          <w:cantSplit/>
-        </w:trPr>
-        <w:tc>
-          <w:tcPr>
-            <w:tcW w:type="dxa" w:w="4680"/>
-            <w:tcBorders>
-              <w:top w:val="single" w:color="BFBFBF" w:sz="2"/>
-              <w:left w:val="single" w:color="BFBFBF" w:sz="2"/>
-              <w:bottom w:val="single" w:color="BFBFBF" w:sz="2"/>
-              <w:right w:val="single" w:color="BFBFBF" w:sz="2"/>
-            </w:tcBorders>
-            <w:shd w:fill="FFFFFF" w:color="auto" w:val="clear"/>
-            <w:tcMar>
-              <w:top w:type="dxa" w:w="80"/>
-              <w:left w:type="dxa" w:w="120"/>
-              <w:bottom w:type="dxa" w:w="80"/>
-              <w:right w:type="dxa" w:w="120"/>
-            </w:tcMar>
-            <w:vAlign w:val="center"/>
-          </w:tcPr>
-          <w:p>
-            <w:pPr>
-              <w:widowControl/>
-              <w:spacing w:after="0" w:before="0" w:lineRule="auto"/>
-            </w:pPr>
-            <w:r>
-              <w:rPr>
-                <w:rFonts w:ascii="Calibri" w:cs="Calibri" w:eastAsia="Calibri" w:hAnsi="Calibri"/>
-                <w:b w:val="false"/>
-                <w:bCs w:val="false"/>
-                <w:i w:val="false"/>
-                <w:iCs w:val="false"/>
-                <w:color w:val="000000"/>
-                <w:sz w:val="20"/>
-                <w:szCs w:val="20"/>
-              </w:rPr>
-              <w:t xml:space="preserve">No lab order option for the MH counselor role</w:t>
-            </w:r>
-          </w:p>
-        </w:tc>
-        <w:tc>
-          <w:tcPr>
-            <w:tcW w:type="dxa" w:w="4680"/>
-            <w:tcBorders>
-              <w:top w:val="single" w:color="BFBFBF" w:sz="2"/>
-              <w:left w:val="single" w:color="BFBFBF" w:sz="2"/>
-              <w:bottom w:val="single" w:color="BFBFBF" w:sz="2"/>
-              <w:right w:val="single" w:color="BFBFBF" w:sz="2"/>
-            </w:tcBorders>
-            <w:shd w:fill="FFFFFF" w:color="auto" w:val="clear"/>
-            <w:tcMar>
-              <w:top w:type="dxa" w:w="80"/>
-              <w:left w:type="dxa" w:w="120"/>
-              <w:bottom w:type="dxa" w:w="80"/>
-              <w:right w:type="dxa" w:w="120"/>
-            </w:tcMar>
-            <w:vAlign w:val="center"/>
-          </w:tcPr>
-          <w:p>
-            <w:pPr>
-              <w:widowControl/>
-              <w:spacing w:after="0" w:before="0" w:lineRule="auto"/>
-            </w:pPr>
-            <w:r>
-              <w:rPr>
-                <w:rFonts w:ascii="Calibri" w:cs="Calibri" w:eastAsia="Calibri" w:hAnsi="Calibri"/>
-                <w:b w:val="false"/>
-                <w:bCs w:val="false"/>
-                <w:i w:val="false"/>
-                <w:iCs w:val="false"/>
-                <w:color w:val="000000"/>
-                <w:sz w:val="20"/>
-                <w:szCs w:val="20"/>
-              </w:rPr>
-              <w:t xml:space="preserve">Access rights work</w:t>
-            </w:r>
-          </w:p>
-        </w:tc>
-      </w:tr>
-      <w:tr>
-        <w:trPr>
-          <w:cantSplit/>
-        </w:trPr>
-        <w:tc>
-          <w:tcPr>
-            <w:tcW w:type="dxa" w:w="4680"/>
-            <w:tcBorders>
-              <w:top w:val="single" w:color="BFBFBF" w:sz="2"/>
-              <w:left w:val="single" w:color="BFBFBF" w:sz="2"/>
-              <w:bottom w:val="single" w:color="BFBFBF" w:sz="2"/>
-              <w:right w:val="single" w:color="BFBFBF" w:sz="2"/>
-            </w:tcBorders>
-            <w:shd w:fill="FFFFFF" w:color="auto" w:val="clear"/>
-            <w:tcMar>
-              <w:top w:type="dxa" w:w="80"/>
-              <w:left w:type="dxa" w:w="120"/>
-              <w:bottom w:type="dxa" w:w="80"/>
-              <w:right w:type="dxa" w:w="120"/>
-            </w:tcMar>
-            <w:vAlign w:val="center"/>
-          </w:tcPr>
-          <w:p>
-            <w:pPr>
-              <w:widowControl/>
-              <w:spacing w:after="0" w:before="0" w:lineRule="auto"/>
-            </w:pPr>
-            <w:r>
-              <w:rPr>
-                <w:rFonts w:ascii="Calibri" w:cs="Calibri" w:eastAsia="Calibri" w:hAnsi="Calibri"/>
-                <w:b w:val="false"/>
-                <w:bCs w:val="false"/>
-                <w:i w:val="false"/>
-                <w:iCs w:val="false"/>
-                <w:color w:val="000000"/>
-                <w:sz w:val="20"/>
-                <w:szCs w:val="20"/>
-              </w:rPr>
-              <w:t xml:space="preserve">I enter 450 kg → a warning appears</w:t>
-            </w:r>
-          </w:p>
-        </w:tc>
-        <w:tc>
-          <w:tcPr>
-            <w:tcW w:type="dxa" w:w="4680"/>
-            <w:tcBorders>
-              <w:top w:val="single" w:color="BFBFBF" w:sz="2"/>
-              <w:left w:val="single" w:color="BFBFBF" w:sz="2"/>
-              <w:bottom w:val="single" w:color="BFBFBF" w:sz="2"/>
-              <w:right w:val="single" w:color="BFBFBF" w:sz="2"/>
-            </w:tcBorders>
-            <w:shd w:fill="FFFFFF" w:color="auto" w:val="clear"/>
-            <w:tcMar>
-              <w:top w:type="dxa" w:w="80"/>
-              <w:left w:type="dxa" w:w="120"/>
-              <w:bottom w:type="dxa" w:w="80"/>
-              <w:right w:type="dxa" w:w="120"/>
-            </w:tcMar>
-            <w:vAlign w:val="center"/>
-          </w:tcPr>
-          <w:p>
-            <w:pPr>
-              <w:widowControl/>
-              <w:spacing w:after="0" w:before="0" w:lineRule="auto"/>
-            </w:pPr>
-            <w:r>
-              <w:rPr>
-                <w:rFonts w:ascii="Calibri" w:cs="Calibri" w:eastAsia="Calibri" w:hAnsi="Calibri"/>
-                <w:b w:val="false"/>
-                <w:bCs w:val="false"/>
-                <w:i w:val="false"/>
-                <w:iCs w:val="false"/>
-                <w:color w:val="000000"/>
-                <w:sz w:val="20"/>
-                <w:szCs w:val="20"/>
-              </w:rPr>
-              <w:t xml:space="preserve">Weight is validated</w:t>
-            </w:r>
-          </w:p>
-        </w:tc>
-      </w:tr>
-    </w:tbl>
-    <w:p>
-      <w:pPr>
-        <w:spacing w:after="80" w:before="0" w:lineRule="auto"/>
-      </w:pPr>
     </w:p>
     <w:p>
       <w:pPr>
@@ -2827,7 +2790,7 @@
           <w:sz w:val="20"/>
           <w:szCs w:val="20"/>
         </w:rPr>
-        <w:t xml:space="preserve">One test checks one thing, with a precise result.</w:t>
+        <w:t xml:space="preserve">« PHQ-9 score = 27 », not « the score is correct ». One test checks one thing.</w:t>
       </w:r>
     </w:p>
     <w:p>
@@ -2865,7 +2828,7 @@
           <w:sz w:val="20"/>
           <w:szCs w:val="20"/>
         </w:rPr>
-        <w:t xml:space="preserve">Also write what must not happen (hidden, refused, not allowed).</w:t>
+        <w:t xml:space="preserve">Also write what must not happen: « Clinical diagnosis is read-only for the Mental Health Nurse », not « confidentiality works ».</w:t>
       </w:r>
     </w:p>
     <w:p>
@@ -3038,7 +3001,7 @@
           <w:sz w:val="20"/>
           <w:szCs w:val="20"/>
         </w:rPr>
-        <w:t xml:space="preserve">Tell us your priority forms and areas (for example roles and access, registration, DHIS2) so we review those first.</w:t>
+        <w:t xml:space="preserve">Tell us your priority areas (for example confidentiality, appointments, DHIS2), and the EMR role matching MedCo, MH manager and Data officer.</w:t>
       </w:r>
     </w:p>
     <w:sectPr>

</xml_diff>

<commit_message>
(docs) Keep only test case examples verified against the repository
Drop the guidance sections and hypothetical examples. Every example is
now either confirmed in the configuration or shown as a difference:
F48 completion date validator, per-counselor Mental Health appointment
services, MSF ID generator, and the PHQ-9 score mapped in the Mosul
DHIS2 sync of F31 (F35 itself is not exported). The workbook template
uses the same examples and no pop-up notes.

Co-Authored-By: Claude Opus 5.5 <noreply@anthropic.com>
Claude-Session: https://claude.ai/code/session_01U6uYJ2YYNCsnP72DpH3o5o
</commit_message>
<xml_diff>
--- a/docs/testing/metadonnees/LIME_EMR_Test_case_examples.docx
+++ b/docs/testing/metadonnees/LIME_EMR_Test_case_examples.docx
@@ -89,7 +89,7 @@
           <w:sz w:val="22"/>
           <w:szCs w:val="22"/>
         </w:rPr>
-        <w:t xml:space="preserve">How the MSF metadata workbook becomes automated tests, with nothing new to fill in</w:t>
+        <w:t xml:space="preserve">From the LIME EMR metadata workbook, checked against the Mosul configuration</w:t>
       </w:r>
     </w:p>
     <w:p>
@@ -111,7 +111,7 @@
           <w:sz w:val="24"/>
           <w:szCs w:val="24"/>
         </w:rPr>
-        <w:t xml:space="preserve">What is a test case?</w:t>
+        <w:t xml:space="preserve">1. Form rules: generated from the form tabs</w:t>
       </w:r>
     </w:p>
     <w:p>
@@ -131,49 +131,7 @@
           <w:sz w:val="20"/>
           <w:szCs w:val="20"/>
         </w:rPr>
-        <w:t xml:space="preserve">A test case is one sentence: if I do this, I should see that. It names who does it (role, site) and gives a precise, observable result. Every rule already written in the metadata workbook is a test case; we check it in the EMR automatically and report the result in the Form QA Tracker.</w:t>
-      </w:r>
-    </w:p>
-    <w:p>
-      <w:pPr>
-        <w:keepNext/>
-        <w:keepLines/>
-        <w:widowControl/>
-        <w:spacing w:after="80" w:before="280" w:lineRule="auto"/>
-        <w:outlineLvl w:val="1"/>
-      </w:pPr>
-      <w:r>
-        <w:rPr>
-          <w:rFonts w:ascii="Calibri" w:cs="Calibri" w:eastAsia="Calibri" w:hAnsi="Calibri"/>
-          <w:b/>
-          <w:bCs/>
-          <w:i w:val="false"/>
-          <w:iCs w:val="false"/>
-          <w:color w:val="172F4D"/>
-          <w:sz w:val="24"/>
-          <w:szCs w:val="24"/>
-        </w:rPr>
-        <w:t xml:space="preserve">1. Form rules: already covered, nothing to do</w:t>
-      </w:r>
-    </w:p>
-    <w:p>
-      <w:pPr>
-        <w:widowControl/>
-        <w:spacing w:after="200" w:before="0" w:line="276" w:lineRule="auto"/>
-        <w:jc w:val="both"/>
-      </w:pPr>
-      <w:r>
-        <w:rPr>
-          <w:rFonts w:ascii="Calibri" w:cs="Calibri" w:eastAsia="Calibri" w:hAnsi="Calibri"/>
-          <w:b w:val="false"/>
-          <w:bCs w:val="false"/>
-          <w:i w:val="false"/>
-          <w:iCs w:val="false"/>
-          <w:color w:val="000000"/>
-          <w:sz w:val="20"/>
-          <w:szCs w:val="20"/>
-        </w:rPr>
-        <w:t xml:space="preserve">Each Skip logic, Mandatory and Lower/Upper limit entry of a form tab gives one or two test cases. Examples from F17 Surgery Admission and F48 Blood Transfusion:</w:t>
+        <w:t xml:space="preserve">Each Skip logic, Mandatory and Lower/Upper limit entry gives one or two test cases, checked against the form in the EMR.</w:t>
       </w:r>
     </w:p>
     <w:tbl>
@@ -270,7 +228,7 @@
                 <w:sz w:val="20"/>
                 <w:szCs w:val="20"/>
               </w:rPr>
-              <w:t xml:space="preserve">Test case generated</w:t>
+              <w:t xml:space="preserve">Test case</w:t>
             </w:r>
           </w:p>
         </w:tc>
@@ -308,7 +266,7 @@
                 <w:sz w:val="20"/>
                 <w:szCs w:val="20"/>
               </w:rPr>
-              <w:t xml:space="preserve">Result</w:t>
+              <w:t xml:space="preserve">Today</w:t>
             </w:r>
           </w:p>
         </w:tc>
@@ -351,7 +309,7 @@
                 <w:sz w:val="20"/>
                 <w:szCs w:val="20"/>
               </w:rPr>
-              <w:t xml:space="preserve">Skip logic: Hide question if [Referred to MSF] !== 'Yes' (on « By whom / from where »)</w:t>
+              <w:t xml:space="preserve">F17, « By whom / from where »: Hide question if [Referred to MSF] !== 'Yes'</w:t>
             </w:r>
           </w:p>
         </w:tc>
@@ -470,7 +428,7 @@
                 <w:sz w:val="20"/>
                 <w:szCs w:val="20"/>
               </w:rPr>
-              <w:t xml:space="preserve">Lower limit: 0 (on « Weight at admission (in kg) »)</w:t>
+              <w:t xml:space="preserve">F17, « Weight at admission (in kg) »: Lower limit 0</w:t>
             </w:r>
           </w:p>
         </w:tc>
@@ -589,7 +547,7 @@
                 <w:sz w:val="20"/>
                 <w:szCs w:val="20"/>
               </w:rPr>
-              <w:t xml:space="preserve">Skip logic: Hide question if [Reactions] !== 'Fever', ..., 'Other' (F48, « Management of reactions »)</w:t>
+              <w:t xml:space="preserve">F48, « Management of reactions »: Hide question if [Reactions] !== 'Fever', ..., 'Other'</w:t>
             </w:r>
           </w:p>
         </w:tc>
@@ -665,7 +623,7 @@
                 <w:sz w:val="20"/>
                 <w:szCs w:val="20"/>
               </w:rPr>
-              <w:t xml:space="preserve">❌ Difference: the form does not show it for « Other »</w:t>
+              <w:t xml:space="preserve">❌ The form does not show it for « Other »</w:t>
             </w:r>
           </w:p>
         </w:tc>
@@ -693,7 +651,7 @@
           <w:sz w:val="20"/>
           <w:szCs w:val="20"/>
         </w:rPr>
-        <w:t xml:space="preserve">Across the Release 1 workbook: about 3,900 test cases generated, 91% matching the EMR. Each difference is reviewed together: either the form or the tab is updated.</w:t>
+        <w:t xml:space="preserve">Release 1 workbook: 3,862 test cases generated, 3,533 matching the EMR.</w:t>
       </w:r>
     </w:p>
     <w:p>
@@ -715,7 +673,7 @@
           <w:sz w:val="24"/>
           <w:szCs w:val="24"/>
         </w:rPr>
-        <w:t xml:space="preserve">2. Another test on one question: the Comments column</w:t>
+        <w:t xml:space="preserve">2. Other rules of a question: the Comments column</w:t>
       </w:r>
     </w:p>
     <w:p>
@@ -735,7 +693,7 @@
           <w:sz w:val="20"/>
           <w:szCs w:val="20"/>
         </w:rPr>
-        <w:t xml:space="preserve">For what the columns cannot express (a calculation, a button, a missing limit), write one line per test in the existing Comments column of the form tab: Test: what I do -&gt; what I should see.</w:t>
+        <w:t xml:space="preserve">One line per test in the Comments column of the form tab: Test: what I do -&gt; what I should see.</w:t>
       </w:r>
     </w:p>
     <w:tbl>
@@ -751,8 +709,9 @@
         </w:tblBorders>
       </w:tblPr>
       <w:tblGrid>
-        <w:gridCol w:w="3000"/>
-        <w:gridCol w:w="6360"/>
+        <w:gridCol w:w="2300"/>
+        <w:gridCol w:w="5260"/>
+        <w:gridCol w:w="1800"/>
       </w:tblGrid>
       <w:tr>
         <w:trPr>
@@ -761,7 +720,7 @@
         </w:trPr>
         <w:tc>
           <w:tcPr>
-            <w:tcW w:type="dxa" w:w="3000"/>
+            <w:tcW w:type="dxa" w:w="2300"/>
             <w:tcBorders>
               <w:top w:val="single" w:color="BFBFBF" w:sz="2"/>
               <w:left w:val="single" w:color="BFBFBF" w:sz="2"/>
@@ -799,7 +758,7 @@
         </w:tc>
         <w:tc>
           <w:tcPr>
-            <w:tcW w:type="dxa" w:w="6360"/>
+            <w:tcW w:type="dxa" w:w="5260"/>
             <w:tcBorders>
               <w:top w:val="single" w:color="BFBFBF" w:sz="2"/>
               <w:left w:val="single" w:color="BFBFBF" w:sz="2"/>
@@ -832,6 +791,44 @@
                 <w:szCs w:val="20"/>
               </w:rPr>
               <w:t xml:space="preserve">Comments column</w:t>
+            </w:r>
+          </w:p>
+        </w:tc>
+        <w:tc>
+          <w:tcPr>
+            <w:tcW w:type="dxa" w:w="1800"/>
+            <w:tcBorders>
+              <w:top w:val="single" w:color="BFBFBF" w:sz="2"/>
+              <w:left w:val="single" w:color="BFBFBF" w:sz="2"/>
+              <w:bottom w:val="single" w:color="BFBFBF" w:sz="2"/>
+              <w:right w:val="single" w:color="BFBFBF" w:sz="2"/>
+            </w:tcBorders>
+            <w:shd w:fill="E7E6E6" w:color="auto" w:val="clear"/>
+            <w:tcMar>
+              <w:top w:type="dxa" w:w="80"/>
+              <w:left w:type="dxa" w:w="120"/>
+              <w:bottom w:type="dxa" w:w="80"/>
+              <w:right w:type="dxa" w:w="120"/>
+            </w:tcMar>
+            <w:vAlign w:val="center"/>
+          </w:tcPr>
+          <w:p>
+            <w:pPr>
+              <w:widowControl/>
+              <w:spacing w:after="0" w:before="0" w:lineRule="auto"/>
+            </w:pPr>
+            <w:r>
+              <w:rPr>
+                <w:rFonts w:ascii="Calibri" w:cs="Calibri" w:eastAsia="Calibri" w:hAnsi="Calibri"/>
+                <w:b/>
+                <w:bCs/>
+                <w:i w:val="false"/>
+                <w:iCs w:val="false"/>
+                <w:color w:val="000000"/>
+                <w:sz w:val="20"/>
+                <w:szCs w:val="20"/>
+              </w:rPr>
+              <w:t xml:space="preserve">Today</w:t>
             </w:r>
           </w:p>
         </w:tc>
@@ -842,7 +839,7 @@
         </w:trPr>
         <w:tc>
           <w:tcPr>
-            <w:tcW w:type="dxa" w:w="3000"/>
+            <w:tcW w:type="dxa" w:w="2300"/>
             <w:tcBorders>
               <w:top w:val="single" w:color="BFBFBF" w:sz="2"/>
               <w:left w:val="single" w:color="BFBFBF" w:sz="2"/>
@@ -880,7 +877,7 @@
         </w:tc>
         <w:tc>
           <w:tcPr>
-            <w:tcW w:type="dxa" w:w="6360"/>
+            <w:tcW w:type="dxa" w:w="5260"/>
             <w:tcBorders>
               <w:top w:val="single" w:color="BFBFBF" w:sz="2"/>
               <w:left w:val="single" w:color="BFBFBF" w:sz="2"/>
@@ -913,6 +910,44 @@
                 <w:szCs w:val="20"/>
               </w:rPr>
               <w:t xml:space="preserve">Test: Answer « Nearly every day (3 points) » to the 9 questions -&gt; PHQ-9 score = 27</w:t>
+            </w:r>
+          </w:p>
+        </w:tc>
+        <w:tc>
+          <w:tcPr>
+            <w:tcW w:type="dxa" w:w="1800"/>
+            <w:tcBorders>
+              <w:top w:val="single" w:color="BFBFBF" w:sz="2"/>
+              <w:left w:val="single" w:color="BFBFBF" w:sz="2"/>
+              <w:bottom w:val="single" w:color="BFBFBF" w:sz="2"/>
+              <w:right w:val="single" w:color="BFBFBF" w:sz="2"/>
+            </w:tcBorders>
+            <w:shd w:fill="FFFFFF" w:color="auto" w:val="clear"/>
+            <w:tcMar>
+              <w:top w:type="dxa" w:w="80"/>
+              <w:left w:type="dxa" w:w="120"/>
+              <w:bottom w:type="dxa" w:w="80"/>
+              <w:right w:type="dxa" w:w="120"/>
+            </w:tcMar>
+            <w:vAlign w:val="center"/>
+          </w:tcPr>
+          <w:p>
+            <w:pPr>
+              <w:widowControl/>
+              <w:spacing w:after="0" w:before="0" w:lineRule="auto"/>
+            </w:pPr>
+            <w:r>
+              <w:rPr>
+                <w:rFonts w:ascii="Calibri" w:cs="Calibri" w:eastAsia="Calibri" w:hAnsi="Calibri"/>
+                <w:b w:val="false"/>
+                <w:bCs w:val="false"/>
+                <w:i w:val="false"/>
+                <w:iCs w:val="false"/>
+                <w:color w:val="000000"/>
+                <w:sz w:val="20"/>
+                <w:szCs w:val="20"/>
+              </w:rPr>
+              <w:t xml:space="preserve">✅ Matches</w:t>
             </w:r>
           </w:p>
         </w:tc>
@@ -923,77 +958,115 @@
         </w:trPr>
         <w:tc>
           <w:tcPr>
-            <w:tcW w:type="dxa" w:w="3000"/>
-            <w:tcBorders>
-              <w:top w:val="single" w:color="BFBFBF" w:sz="2"/>
-              <w:left w:val="single" w:color="BFBFBF" w:sz="2"/>
-              <w:bottom w:val="single" w:color="BFBFBF" w:sz="2"/>
-              <w:right w:val="single" w:color="BFBFBF" w:sz="2"/>
-            </w:tcBorders>
-            <w:shd w:fill="FFFFFF" w:color="auto" w:val="clear"/>
-            <w:tcMar>
-              <w:top w:type="dxa" w:w="80"/>
-              <w:left w:type="dxa" w:w="120"/>
-              <w:bottom w:type="dxa" w:w="80"/>
-              <w:right w:type="dxa" w:w="120"/>
-            </w:tcMar>
-            <w:vAlign w:val="center"/>
-          </w:tcPr>
-          <w:p>
-            <w:pPr>
-              <w:widowControl/>
-              <w:spacing w:after="0" w:before="0" w:lineRule="auto"/>
-            </w:pPr>
-            <w:r>
-              <w:rPr>
-                <w:rFonts w:ascii="Calibri" w:cs="Calibri" w:eastAsia="Calibri" w:hAnsi="Calibri"/>
-                <w:b w:val="false"/>
-                <w:bCs w:val="false"/>
-                <w:i w:val="false"/>
-                <w:iCs w:val="false"/>
-                <w:color w:val="000000"/>
-                <w:sz w:val="20"/>
-                <w:szCs w:val="20"/>
-              </w:rPr>
-              <w:t xml:space="preserve">F17, Order medications</w:t>
-            </w:r>
-          </w:p>
-        </w:tc>
-        <w:tc>
-          <w:tcPr>
-            <w:tcW w:type="dxa" w:w="6360"/>
-            <w:tcBorders>
-              <w:top w:val="single" w:color="BFBFBF" w:sz="2"/>
-              <w:left w:val="single" w:color="BFBFBF" w:sz="2"/>
-              <w:bottom w:val="single" w:color="BFBFBF" w:sz="2"/>
-              <w:right w:val="single" w:color="BFBFBF" w:sz="2"/>
-            </w:tcBorders>
-            <w:shd w:fill="FFFFFF" w:color="auto" w:val="clear"/>
-            <w:tcMar>
-              <w:top w:type="dxa" w:w="80"/>
-              <w:left w:type="dxa" w:w="120"/>
-              <w:bottom w:type="dxa" w:w="80"/>
-              <w:right w:type="dxa" w:w="120"/>
-            </w:tcMar>
-            <w:vAlign w:val="center"/>
-          </w:tcPr>
-          <w:p>
-            <w:pPr>
-              <w:widowControl/>
-              <w:spacing w:after="0" w:before="0" w:lineRule="auto"/>
-            </w:pPr>
-            <w:r>
-              <w:rPr>
-                <w:rFonts w:ascii="Calibri" w:cs="Calibri" w:eastAsia="Calibri" w:hAnsi="Calibri"/>
-                <w:b w:val="false"/>
-                <w:bCs w:val="false"/>
-                <w:i w:val="false"/>
-                <w:iCs w:val="false"/>
-                <w:color w:val="000000"/>
-                <w:sz w:val="20"/>
-                <w:szCs w:val="20"/>
-              </w:rPr>
-              <w:t xml:space="preserve">Test: Click « Order medications » -&gt; The order basket opens for this patient</w:t>
+            <w:tcW w:type="dxa" w:w="2300"/>
+            <w:tcBorders>
+              <w:top w:val="single" w:color="BFBFBF" w:sz="2"/>
+              <w:left w:val="single" w:color="BFBFBF" w:sz="2"/>
+              <w:bottom w:val="single" w:color="BFBFBF" w:sz="2"/>
+              <w:right w:val="single" w:color="BFBFBF" w:sz="2"/>
+            </w:tcBorders>
+            <w:shd w:fill="FFFFFF" w:color="auto" w:val="clear"/>
+            <w:tcMar>
+              <w:top w:type="dxa" w:w="80"/>
+              <w:left w:type="dxa" w:w="120"/>
+              <w:bottom w:type="dxa" w:w="80"/>
+              <w:right w:type="dxa" w:w="120"/>
+            </w:tcMar>
+            <w:vAlign w:val="center"/>
+          </w:tcPr>
+          <w:p>
+            <w:pPr>
+              <w:widowControl/>
+              <w:spacing w:after="0" w:before="0" w:lineRule="auto"/>
+            </w:pPr>
+            <w:r>
+              <w:rPr>
+                <w:rFonts w:ascii="Calibri" w:cs="Calibri" w:eastAsia="Calibri" w:hAnsi="Calibri"/>
+                <w:b w:val="false"/>
+                <w:bCs w:val="false"/>
+                <w:i w:val="false"/>
+                <w:iCs w:val="false"/>
+                <w:color w:val="000000"/>
+                <w:sz w:val="20"/>
+                <w:szCs w:val="20"/>
+              </w:rPr>
+              <w:t xml:space="preserve">F48, Completion date</w:t>
+            </w:r>
+          </w:p>
+        </w:tc>
+        <w:tc>
+          <w:tcPr>
+            <w:tcW w:type="dxa" w:w="5260"/>
+            <w:tcBorders>
+              <w:top w:val="single" w:color="BFBFBF" w:sz="2"/>
+              <w:left w:val="single" w:color="BFBFBF" w:sz="2"/>
+              <w:bottom w:val="single" w:color="BFBFBF" w:sz="2"/>
+              <w:right w:val="single" w:color="BFBFBF" w:sz="2"/>
+            </w:tcBorders>
+            <w:shd w:fill="FFFFFF" w:color="auto" w:val="clear"/>
+            <w:tcMar>
+              <w:top w:type="dxa" w:w="80"/>
+              <w:left w:type="dxa" w:w="120"/>
+              <w:bottom w:type="dxa" w:w="80"/>
+              <w:right w:type="dxa" w:w="120"/>
+            </w:tcMar>
+            <w:vAlign w:val="center"/>
+          </w:tcPr>
+          <w:p>
+            <w:pPr>
+              <w:widowControl/>
+              <w:spacing w:after="0" w:before="0" w:lineRule="auto"/>
+            </w:pPr>
+            <w:r>
+              <w:rPr>
+                <w:rFonts w:ascii="Calibri" w:cs="Calibri" w:eastAsia="Calibri" w:hAnsi="Calibri"/>
+                <w:b w:val="false"/>
+                <w:bCs w:val="false"/>
+                <w:i w:val="false"/>
+                <w:iCs w:val="false"/>
+                <w:color w:val="000000"/>
+                <w:sz w:val="20"/>
+                <w:szCs w:val="20"/>
+              </w:rPr>
+              <w:t xml:space="preserve">Test: Enter a completion date before the start date -&gt; Message « Completion date cannot be before start date »</w:t>
+            </w:r>
+          </w:p>
+        </w:tc>
+        <w:tc>
+          <w:tcPr>
+            <w:tcW w:type="dxa" w:w="1800"/>
+            <w:tcBorders>
+              <w:top w:val="single" w:color="BFBFBF" w:sz="2"/>
+              <w:left w:val="single" w:color="BFBFBF" w:sz="2"/>
+              <w:bottom w:val="single" w:color="BFBFBF" w:sz="2"/>
+              <w:right w:val="single" w:color="BFBFBF" w:sz="2"/>
+            </w:tcBorders>
+            <w:shd w:fill="FFFFFF" w:color="auto" w:val="clear"/>
+            <w:tcMar>
+              <w:top w:type="dxa" w:w="80"/>
+              <w:left w:type="dxa" w:w="120"/>
+              <w:bottom w:type="dxa" w:w="80"/>
+              <w:right w:type="dxa" w:w="120"/>
+            </w:tcMar>
+            <w:vAlign w:val="center"/>
+          </w:tcPr>
+          <w:p>
+            <w:pPr>
+              <w:widowControl/>
+              <w:spacing w:after="0" w:before="0" w:lineRule="auto"/>
+            </w:pPr>
+            <w:r>
+              <w:rPr>
+                <w:rFonts w:ascii="Calibri" w:cs="Calibri" w:eastAsia="Calibri" w:hAnsi="Calibri"/>
+                <w:b w:val="false"/>
+                <w:bCs w:val="false"/>
+                <w:i w:val="false"/>
+                <w:iCs w:val="false"/>
+                <w:color w:val="000000"/>
+                <w:sz w:val="20"/>
+                <w:szCs w:val="20"/>
+              </w:rPr>
+              <w:t xml:space="preserve">✅ Matches</w:t>
             </w:r>
           </w:p>
         </w:tc>
@@ -1004,107 +1077,120 @@
         </w:trPr>
         <w:tc>
           <w:tcPr>
-            <w:tcW w:type="dxa" w:w="3000"/>
-            <w:tcBorders>
-              <w:top w:val="single" w:color="BFBFBF" w:sz="2"/>
-              <w:left w:val="single" w:color="BFBFBF" w:sz="2"/>
-              <w:bottom w:val="single" w:color="BFBFBF" w:sz="2"/>
-              <w:right w:val="single" w:color="BFBFBF" w:sz="2"/>
-            </w:tcBorders>
-            <w:shd w:fill="FFFFFF" w:color="auto" w:val="clear"/>
-            <w:tcMar>
-              <w:top w:type="dxa" w:w="80"/>
-              <w:left w:type="dxa" w:w="120"/>
-              <w:bottom w:type="dxa" w:w="80"/>
-              <w:right w:type="dxa" w:w="120"/>
-            </w:tcMar>
-            <w:vAlign w:val="center"/>
-          </w:tcPr>
-          <w:p>
-            <w:pPr>
-              <w:widowControl/>
-              <w:spacing w:after="0" w:before="0" w:lineRule="auto"/>
-            </w:pPr>
-            <w:r>
-              <w:rPr>
-                <w:rFonts w:ascii="Calibri" w:cs="Calibri" w:eastAsia="Calibri" w:hAnsi="Calibri"/>
-                <w:b w:val="false"/>
-                <w:bCs w:val="false"/>
-                <w:i w:val="false"/>
-                <w:iCs w:val="false"/>
-                <w:color w:val="000000"/>
-                <w:sz w:val="20"/>
-                <w:szCs w:val="20"/>
-              </w:rPr>
-              <w:t xml:space="preserve">F17, Weight at admission (in kg)</w:t>
-            </w:r>
-          </w:p>
-        </w:tc>
-        <w:tc>
-          <w:tcPr>
-            <w:tcW w:type="dxa" w:w="6360"/>
-            <w:tcBorders>
-              <w:top w:val="single" w:color="BFBFBF" w:sz="2"/>
-              <w:left w:val="single" w:color="BFBFBF" w:sz="2"/>
-              <w:bottom w:val="single" w:color="BFBFBF" w:sz="2"/>
-              <w:right w:val="single" w:color="BFBFBF" w:sz="2"/>
-            </w:tcBorders>
-            <w:shd w:fill="FFFFFF" w:color="auto" w:val="clear"/>
-            <w:tcMar>
-              <w:top w:type="dxa" w:w="80"/>
-              <w:left w:type="dxa" w:w="120"/>
-              <w:bottom w:type="dxa" w:w="80"/>
-              <w:right w:type="dxa" w:w="120"/>
-            </w:tcMar>
-            <w:vAlign w:val="center"/>
-          </w:tcPr>
-          <w:p>
-            <w:pPr>
-              <w:widowControl/>
-              <w:spacing w:after="0" w:before="0" w:lineRule="auto"/>
-            </w:pPr>
-            <w:r>
-              <w:rPr>
-                <w:rFonts w:ascii="Calibri" w:cs="Calibri" w:eastAsia="Calibri" w:hAnsi="Calibri"/>
-                <w:b w:val="false"/>
-                <w:bCs w:val="false"/>
-                <w:i w:val="false"/>
-                <w:iCs w:val="false"/>
-                <w:color w:val="000000"/>
-                <w:sz w:val="20"/>
-                <w:szCs w:val="20"/>
-              </w:rPr>
-              <w:t xml:space="preserve">Test: Enter 450 -&gt; The value is refused</w:t>
+            <w:tcW w:type="dxa" w:w="2300"/>
+            <w:tcBorders>
+              <w:top w:val="single" w:color="BFBFBF" w:sz="2"/>
+              <w:left w:val="single" w:color="BFBFBF" w:sz="2"/>
+              <w:bottom w:val="single" w:color="BFBFBF" w:sz="2"/>
+              <w:right w:val="single" w:color="BFBFBF" w:sz="2"/>
+            </w:tcBorders>
+            <w:shd w:fill="FFFFFF" w:color="auto" w:val="clear"/>
+            <w:tcMar>
+              <w:top w:type="dxa" w:w="80"/>
+              <w:left w:type="dxa" w:w="120"/>
+              <w:bottom w:type="dxa" w:w="80"/>
+              <w:right w:type="dxa" w:w="120"/>
+            </w:tcMar>
+            <w:vAlign w:val="center"/>
+          </w:tcPr>
+          <w:p>
+            <w:pPr>
+              <w:widowControl/>
+              <w:spacing w:after="0" w:before="0" w:lineRule="auto"/>
+            </w:pPr>
+            <w:r>
+              <w:rPr>
+                <w:rFonts w:ascii="Calibri" w:cs="Calibri" w:eastAsia="Calibri" w:hAnsi="Calibri"/>
+                <w:b w:val="false"/>
+                <w:bCs w:val="false"/>
+                <w:i w:val="false"/>
+                <w:iCs w:val="false"/>
+                <w:color w:val="000000"/>
+                <w:sz w:val="20"/>
+                <w:szCs w:val="20"/>
+              </w:rPr>
+              <w:t xml:space="preserve">F17, Order medications</w:t>
+            </w:r>
+          </w:p>
+        </w:tc>
+        <w:tc>
+          <w:tcPr>
+            <w:tcW w:type="dxa" w:w="5260"/>
+            <w:tcBorders>
+              <w:top w:val="single" w:color="BFBFBF" w:sz="2"/>
+              <w:left w:val="single" w:color="BFBFBF" w:sz="2"/>
+              <w:bottom w:val="single" w:color="BFBFBF" w:sz="2"/>
+              <w:right w:val="single" w:color="BFBFBF" w:sz="2"/>
+            </w:tcBorders>
+            <w:shd w:fill="FFFFFF" w:color="auto" w:val="clear"/>
+            <w:tcMar>
+              <w:top w:type="dxa" w:w="80"/>
+              <w:left w:type="dxa" w:w="120"/>
+              <w:bottom w:type="dxa" w:w="80"/>
+              <w:right w:type="dxa" w:w="120"/>
+            </w:tcMar>
+            <w:vAlign w:val="center"/>
+          </w:tcPr>
+          <w:p>
+            <w:pPr>
+              <w:widowControl/>
+              <w:spacing w:after="0" w:before="0" w:lineRule="auto"/>
+            </w:pPr>
+            <w:r>
+              <w:rPr>
+                <w:rFonts w:ascii="Calibri" w:cs="Calibri" w:eastAsia="Calibri" w:hAnsi="Calibri"/>
+                <w:b w:val="false"/>
+                <w:bCs w:val="false"/>
+                <w:i w:val="false"/>
+                <w:iCs w:val="false"/>
+                <w:color w:val="000000"/>
+                <w:sz w:val="20"/>
+                <w:szCs w:val="20"/>
+              </w:rPr>
+              <w:t xml:space="preserve">Test: Click « Order medications » -&gt; The order basket opens</w:t>
+            </w:r>
+          </w:p>
+        </w:tc>
+        <w:tc>
+          <w:tcPr>
+            <w:tcW w:type="dxa" w:w="1800"/>
+            <w:tcBorders>
+              <w:top w:val="single" w:color="BFBFBF" w:sz="2"/>
+              <w:left w:val="single" w:color="BFBFBF" w:sz="2"/>
+              <w:bottom w:val="single" w:color="BFBFBF" w:sz="2"/>
+              <w:right w:val="single" w:color="BFBFBF" w:sz="2"/>
+            </w:tcBorders>
+            <w:shd w:fill="FFFFFF" w:color="auto" w:val="clear"/>
+            <w:tcMar>
+              <w:top w:type="dxa" w:w="80"/>
+              <w:left w:type="dxa" w:w="120"/>
+              <w:bottom w:type="dxa" w:w="80"/>
+              <w:right w:type="dxa" w:w="120"/>
+            </w:tcMar>
+            <w:vAlign w:val="center"/>
+          </w:tcPr>
+          <w:p>
+            <w:pPr>
+              <w:widowControl/>
+              <w:spacing w:after="0" w:before="0" w:lineRule="auto"/>
+            </w:pPr>
+            <w:r>
+              <w:rPr>
+                <w:rFonts w:ascii="Calibri" w:cs="Calibri" w:eastAsia="Calibri" w:hAnsi="Calibri"/>
+                <w:b w:val="false"/>
+                <w:bCs w:val="false"/>
+                <w:i w:val="false"/>
+                <w:iCs w:val="false"/>
+                <w:color w:val="000000"/>
+                <w:sz w:val="20"/>
+                <w:szCs w:val="20"/>
+              </w:rPr>
+              <w:t xml:space="preserve">✅ Matches</w:t>
             </w:r>
           </w:p>
         </w:tc>
       </w:tr>
     </w:tbl>
-    <w:p>
-      <w:pPr>
-        <w:spacing w:after="60" w:before="0" w:lineRule="auto"/>
-      </w:pPr>
-    </w:p>
-    <w:p>
-      <w:pPr>
-        <w:widowControl/>
-        <w:spacing w:after="200" w:before="0" w:line="276" w:lineRule="auto"/>
-        <w:jc w:val="both"/>
-      </w:pPr>
-      <w:r>
-        <w:rPr>
-          <w:rFonts w:ascii="Calibri" w:cs="Calibri" w:eastAsia="Calibri" w:hAnsi="Calibri"/>
-          <w:b w:val="false"/>
-          <w:bCs w:val="false"/>
-          <w:i/>
-          <w:iCs/>
-          <w:color w:val="5F6D6A"/>
-          <w:sz w:val="20"/>
-          <w:szCs w:val="20"/>
-        </w:rPr>
-        <w:t xml:space="preserve">OpenMRS 3 forms refuse a value outside the Lower/Upper limit; they cannot show a soft warning. The weight test therefore also asks for an Upper limit, which F17 does not have today.</w:t>
-      </w:r>
-    </w:p>
     <w:p>
       <w:pPr>
         <w:keepNext/>
@@ -1124,7 +1210,7 @@
           <w:sz w:val="24"/>
           <w:szCs w:val="24"/>
         </w:rPr>
-        <w:t xml:space="preserve">3. Beyond one question or beyond forms: the User flow template tab</w:t>
+        <w:t xml:space="preserve">3. Beyond one question: the User flow template tab</w:t>
       </w:r>
     </w:p>
     <w:p>
@@ -1144,7 +1230,7 @@
           <w:sz w:val="20"/>
           <w:szCs w:val="20"/>
         </w:rPr>
-        <w:t xml:space="preserve">Patient journeys, user privileges and confidentiality, appointments, registration and DHIS2 go in the existing User flow template tab, one step per row. Step starts with a short code; Action is what I do; Description is what I should see. User is the EMR role (workbook role name in brackets). ROLES-2 and ROLES-3 come from the User roles and privileges tab and show two differences to review together.</w:t>
+        <w:t xml:space="preserve">One step per row. Action is what I do, Description is what I should see, User is the EMR role (workbook role name in brackets).</w:t>
       </w:r>
     </w:p>
     <w:tbl>
@@ -1281,7 +1367,7 @@
                 <w:sz w:val="20"/>
                 <w:szCs w:val="20"/>
               </w:rPr>
-              <w:t xml:space="preserve">Description (what I should see)</w:t>
+              <w:t xml:space="preserve">Description</w:t>
             </w:r>
           </w:p>
         </w:tc>
@@ -1400,7 +1486,7 @@
                 <w:sz w:val="20"/>
                 <w:szCs w:val="20"/>
               </w:rPr>
-              <w:t xml:space="preserve">F31-1</w:t>
+              <w:t xml:space="preserve">ROLES-1</w:t>
             </w:r>
           </w:p>
         </w:tc>
@@ -1438,7 +1524,7 @@
                 <w:sz w:val="20"/>
                 <w:szCs w:val="20"/>
               </w:rPr>
-              <w:t xml:space="preserve">Save an F31 mhGAP Baseline during an active visit, then open the patient chart</w:t>
+              <w:t xml:space="preserve">Open the patient chart of a mental health patient</w:t>
             </w:r>
           </w:p>
         </w:tc>
@@ -1476,7 +1562,7 @@
                 <w:sz w:val="20"/>
                 <w:szCs w:val="20"/>
               </w:rPr>
-              <w:t xml:space="preserve">The form appears under the visit in the Visits tab and in Forms &amp; Notes</w:t>
+              <w:t xml:space="preserve">Mental health encounters are not visible</w:t>
             </w:r>
           </w:p>
         </w:tc>
@@ -1514,7 +1600,7 @@
                 <w:sz w:val="20"/>
                 <w:szCs w:val="20"/>
               </w:rPr>
-              <w:t xml:space="preserve">Mental Health Counselor (MH counselor)</w:t>
+              <w:t xml:space="preserve">Registration Officer (Registration Clerk)</w:t>
             </w:r>
           </w:p>
         </w:tc>
@@ -1552,7 +1638,7 @@
                 <w:sz w:val="20"/>
                 <w:szCs w:val="20"/>
               </w:rPr>
-              <w:t xml:space="preserve">To test</w:t>
+              <w:t xml:space="preserve">✅ Matches</w:t>
             </w:r>
           </w:p>
         </w:tc>
@@ -1595,7 +1681,7 @@
                 <w:sz w:val="20"/>
                 <w:szCs w:val="20"/>
               </w:rPr>
-              <w:t xml:space="preserve">ROLES-1</w:t>
+              <w:t xml:space="preserve">ROLES-2</w:t>
             </w:r>
           </w:p>
         </w:tc>
@@ -1633,7 +1719,7 @@
                 <w:sz w:val="20"/>
                 <w:szCs w:val="20"/>
               </w:rPr>
-              <w:t xml:space="preserve">Open the patient chart of a mental health patient</w:t>
+              <w:t xml:space="preserve">Open an F31 mhGAP Baseline, go to Clinical diagnosis</w:t>
             </w:r>
           </w:p>
         </w:tc>
@@ -1671,7 +1757,7 @@
                 <w:sz w:val="20"/>
                 <w:szCs w:val="20"/>
               </w:rPr>
-              <w:t xml:space="preserve">Mental health forms are not visible</w:t>
+              <w:t xml:space="preserve">The section is read-only (no « Edit sensitive mental health fields » right)</w:t>
             </w:r>
           </w:p>
         </w:tc>
@@ -1709,7 +1795,7 @@
                 <w:sz w:val="20"/>
                 <w:szCs w:val="20"/>
               </w:rPr>
-              <w:t xml:space="preserve">Registration Officer (Registration Clerk)</w:t>
+              <w:t xml:space="preserve">Mental Health Nurse</w:t>
             </w:r>
           </w:p>
         </w:tc>
@@ -1747,7 +1833,7 @@
                 <w:sz w:val="20"/>
                 <w:szCs w:val="20"/>
               </w:rPr>
-              <w:t xml:space="preserve">✅ Config matches</w:t>
+              <w:t xml:space="preserve">❌ Not locked in F31 (it was in F03)</w:t>
             </w:r>
           </w:p>
         </w:tc>
@@ -1790,7 +1876,7 @@
                 <w:sz w:val="20"/>
                 <w:szCs w:val="20"/>
               </w:rPr>
-              <w:t xml:space="preserve">ROLES-2</w:t>
+              <w:t xml:space="preserve">ROLES-3</w:t>
             </w:r>
           </w:p>
         </w:tc>
@@ -1828,7 +1914,7 @@
                 <w:sz w:val="20"/>
                 <w:szCs w:val="20"/>
               </w:rPr>
-              <w:t xml:space="preserve">Open an F31 mhGAP Baseline, go to Clinical diagnosis</w:t>
+              <w:t xml:space="preserve">Try to order a lab test</w:t>
             </w:r>
           </w:p>
         </w:tc>
@@ -1866,7 +1952,7 @@
                 <w:sz w:val="20"/>
                 <w:szCs w:val="20"/>
               </w:rPr>
-              <w:t xml:space="preserve">The section is read-only without the « Edit sensitive mental health fields » right</w:t>
+              <w:t xml:space="preserve">No lab order option (matrix: « Order lab test » blank)</w:t>
             </w:r>
           </w:p>
         </w:tc>
@@ -1904,7 +1990,7 @@
                 <w:sz w:val="20"/>
                 <w:szCs w:val="20"/>
               </w:rPr>
-              <w:t xml:space="preserve">Mental Health Nurse</w:t>
+              <w:t xml:space="preserve">Mental Health Counselor (MH counselor)</w:t>
             </w:r>
           </w:p>
         </w:tc>
@@ -1942,7 +2028,7 @@
                 <w:sz w:val="20"/>
                 <w:szCs w:val="20"/>
               </w:rPr>
-              <w:t xml:space="preserve">❌ Not locked in F31 (was in F03)</w:t>
+              <w:t xml:space="preserve">❌ The EMR role can add orders</w:t>
             </w:r>
           </w:p>
         </w:tc>
@@ -1985,7 +2071,7 @@
                 <w:sz w:val="20"/>
                 <w:szCs w:val="20"/>
               </w:rPr>
-              <w:t xml:space="preserve">ROLES-3</w:t>
+              <w:t xml:space="preserve">APPT-1</w:t>
             </w:r>
           </w:p>
         </w:tc>
@@ -2023,7 +2109,7 @@
                 <w:sz w:val="20"/>
                 <w:szCs w:val="20"/>
               </w:rPr>
-              <w:t xml:space="preserve">Open the order basket, try to order a lab test</w:t>
+              <w:t xml:space="preserve">Book a follow-up appointment</w:t>
             </w:r>
           </w:p>
         </w:tc>
@@ -2061,7 +2147,7 @@
                 <w:sz w:val="20"/>
                 <w:szCs w:val="20"/>
               </w:rPr>
-              <w:t xml:space="preserve">No lab order option</w:t>
+              <w:t xml:space="preserve">Services: Mental Health, and Mental Health - AB, DT, KA, SA, SK</w:t>
             </w:r>
           </w:p>
         </w:tc>
@@ -2099,7 +2185,7 @@
                 <w:sz w:val="20"/>
                 <w:szCs w:val="20"/>
               </w:rPr>
-              <w:t xml:space="preserve">Mental Health Counselor (MH counselor)</w:t>
+              <w:t xml:space="preserve">Mental Health Counselor</w:t>
             </w:r>
           </w:p>
         </w:tc>
@@ -2137,7 +2223,7 @@
                 <w:sz w:val="20"/>
                 <w:szCs w:val="20"/>
               </w:rPr>
-              <w:t xml:space="preserve">❌ The EMR role can add orders</w:t>
+              <w:t xml:space="preserve">✅ Matches</w:t>
             </w:r>
           </w:p>
         </w:tc>
@@ -2180,7 +2266,7 @@
                 <w:sz w:val="20"/>
                 <w:szCs w:val="20"/>
               </w:rPr>
-              <w:t xml:space="preserve">APPT-1</w:t>
+              <w:t xml:space="preserve">REG-1</w:t>
             </w:r>
           </w:p>
         </w:tc>
@@ -2218,7 +2304,7 @@
                 <w:sz w:val="20"/>
                 <w:szCs w:val="20"/>
               </w:rPr>
-              <w:t xml:space="preserve">Book a follow-up appointment</w:t>
+              <w:t xml:space="preserve">Register a new patient</w:t>
             </w:r>
           </w:p>
         </w:tc>
@@ -2256,7 +2342,7 @@
                 <w:sz w:val="20"/>
                 <w:szCs w:val="20"/>
               </w:rPr>
-              <w:t xml:space="preserve">One service per counselor: Mental Health - AB, DT, KA, SA, SK</w:t>
+              <w:t xml:space="preserve">An MSF ID is generated automatically: prefix IQ146-, at most 16 characters</w:t>
             </w:r>
           </w:p>
         </w:tc>
@@ -2332,7 +2418,7 @@
                 <w:sz w:val="20"/>
                 <w:szCs w:val="20"/>
               </w:rPr>
-              <w:t xml:space="preserve">To test</w:t>
+              <w:t xml:space="preserve">✅ Matches</w:t>
             </w:r>
           </w:p>
         </w:tc>
@@ -2375,7 +2461,7 @@
                 <w:sz w:val="20"/>
                 <w:szCs w:val="20"/>
               </w:rPr>
-              <w:t xml:space="preserve">REG-1</w:t>
+              <w:t xml:space="preserve">DHIS2-1</w:t>
             </w:r>
           </w:p>
         </w:tc>
@@ -2413,7 +2499,7 @@
                 <w:sz w:val="20"/>
                 <w:szCs w:val="20"/>
               </w:rPr>
-              <w:t xml:space="preserve">Register a new patient</w:t>
+              <w:t xml:space="preserve">Save an F31 mhGAP Baseline with a PHQ-9 score</w:t>
             </w:r>
           </w:p>
         </w:tc>
@@ -2451,7 +2537,7 @@
                 <w:sz w:val="20"/>
                 <w:szCs w:val="20"/>
               </w:rPr>
-              <w:t xml:space="preserve">An MSF ID is generated automatically: prefix IQ146-, at most 16 characters</w:t>
+              <w:t xml:space="preserve">After the daily sync (17:00), the PHQ-9 score is in DHIS2</w:t>
             </w:r>
           </w:p>
         </w:tc>
@@ -2489,7 +2575,7 @@
                 <w:sz w:val="20"/>
                 <w:szCs w:val="20"/>
               </w:rPr>
-              <w:t xml:space="preserve">Registration Officer</w:t>
+              <w:t xml:space="preserve">Automatic</w:t>
             </w:r>
           </w:p>
         </w:tc>
@@ -2527,483 +2613,12 @@
                 <w:sz w:val="20"/>
                 <w:szCs w:val="20"/>
               </w:rPr>
-              <w:t xml:space="preserve">✅ Config matches</w:t>
-            </w:r>
-          </w:p>
-        </w:tc>
-      </w:tr>
-      <w:tr>
-        <w:trPr>
-          <w:cantSplit/>
-        </w:trPr>
-        <w:tc>
-          <w:tcPr>
-            <w:tcW w:type="dxa" w:w="1040"/>
-            <w:tcBorders>
-              <w:top w:val="single" w:color="BFBFBF" w:sz="2"/>
-              <w:left w:val="single" w:color="BFBFBF" w:sz="2"/>
-              <w:bottom w:val="single" w:color="BFBFBF" w:sz="2"/>
-              <w:right w:val="single" w:color="BFBFBF" w:sz="2"/>
-            </w:tcBorders>
-            <w:shd w:fill="FFFFFF" w:color="auto" w:val="clear"/>
-            <w:tcMar>
-              <w:top w:type="dxa" w:w="80"/>
-              <w:left w:type="dxa" w:w="120"/>
-              <w:bottom w:type="dxa" w:w="80"/>
-              <w:right w:type="dxa" w:w="120"/>
-            </w:tcMar>
-            <w:vAlign w:val="center"/>
-          </w:tcPr>
-          <w:p>
-            <w:pPr>
-              <w:widowControl/>
-              <w:spacing w:after="0" w:before="0" w:lineRule="auto"/>
-            </w:pPr>
-            <w:r>
-              <w:rPr>
-                <w:rFonts w:ascii="Calibri" w:cs="Calibri" w:eastAsia="Calibri" w:hAnsi="Calibri"/>
-                <w:b w:val="false"/>
-                <w:bCs w:val="false"/>
-                <w:i w:val="false"/>
-                <w:iCs w:val="false"/>
-                <w:color w:val="000000"/>
-                <w:sz w:val="20"/>
-                <w:szCs w:val="20"/>
-              </w:rPr>
-              <w:t xml:space="preserve">DHIS2-1</w:t>
-            </w:r>
-          </w:p>
-        </w:tc>
-        <w:tc>
-          <w:tcPr>
-            <w:tcW w:type="dxa" w:w="2300"/>
-            <w:tcBorders>
-              <w:top w:val="single" w:color="BFBFBF" w:sz="2"/>
-              <w:left w:val="single" w:color="BFBFBF" w:sz="2"/>
-              <w:bottom w:val="single" w:color="BFBFBF" w:sz="2"/>
-              <w:right w:val="single" w:color="BFBFBF" w:sz="2"/>
-            </w:tcBorders>
-            <w:shd w:fill="FFFFFF" w:color="auto" w:val="clear"/>
-            <w:tcMar>
-              <w:top w:type="dxa" w:w="80"/>
-              <w:left w:type="dxa" w:w="120"/>
-              <w:bottom w:type="dxa" w:w="80"/>
-              <w:right w:type="dxa" w:w="120"/>
-            </w:tcMar>
-            <w:vAlign w:val="center"/>
-          </w:tcPr>
-          <w:p>
-            <w:pPr>
-              <w:widowControl/>
-              <w:spacing w:after="0" w:before="0" w:lineRule="auto"/>
-            </w:pPr>
-            <w:r>
-              <w:rPr>
-                <w:rFonts w:ascii="Calibri" w:cs="Calibri" w:eastAsia="Calibri" w:hAnsi="Calibri"/>
-                <w:b w:val="false"/>
-                <w:bCs w:val="false"/>
-                <w:i w:val="false"/>
-                <w:iCs w:val="false"/>
-                <w:color w:val="000000"/>
-                <w:sz w:val="20"/>
-                <w:szCs w:val="20"/>
-              </w:rPr>
-              <w:t xml:space="preserve">Save an F35 PHQ-9, wait for the daily DHIS2 sync</w:t>
-            </w:r>
-          </w:p>
-        </w:tc>
-        <w:tc>
-          <w:tcPr>
-            <w:tcW w:type="dxa" w:w="2700"/>
-            <w:tcBorders>
-              <w:top w:val="single" w:color="BFBFBF" w:sz="2"/>
-              <w:left w:val="single" w:color="BFBFBF" w:sz="2"/>
-              <w:bottom w:val="single" w:color="BFBFBF" w:sz="2"/>
-              <w:right w:val="single" w:color="BFBFBF" w:sz="2"/>
-            </w:tcBorders>
-            <w:shd w:fill="FFFFFF" w:color="auto" w:val="clear"/>
-            <w:tcMar>
-              <w:top w:type="dxa" w:w="80"/>
-              <w:left w:type="dxa" w:w="120"/>
-              <w:bottom w:type="dxa" w:w="80"/>
-              <w:right w:type="dxa" w:w="120"/>
-            </w:tcMar>
-            <w:vAlign w:val="center"/>
-          </w:tcPr>
-          <w:p>
-            <w:pPr>
-              <w:widowControl/>
-              <w:spacing w:after="0" w:before="0" w:lineRule="auto"/>
-            </w:pPr>
-            <w:r>
-              <w:rPr>
-                <w:rFonts w:ascii="Calibri" w:cs="Calibri" w:eastAsia="Calibri" w:hAnsi="Calibri"/>
-                <w:b w:val="false"/>
-                <w:bCs w:val="false"/>
-                <w:i w:val="false"/>
-                <w:iCs w:val="false"/>
-                <w:color w:val="000000"/>
-                <w:sz w:val="20"/>
-                <w:szCs w:val="20"/>
-              </w:rPr>
-              <w:t xml:space="preserve">The PHQ-9 score appears in DHIS2 for that patient</w:t>
-            </w:r>
-          </w:p>
-        </w:tc>
-        <w:tc>
-          <w:tcPr>
-            <w:tcW w:type="dxa" w:w="1720"/>
-            <w:tcBorders>
-              <w:top w:val="single" w:color="BFBFBF" w:sz="2"/>
-              <w:left w:val="single" w:color="BFBFBF" w:sz="2"/>
-              <w:bottom w:val="single" w:color="BFBFBF" w:sz="2"/>
-              <w:right w:val="single" w:color="BFBFBF" w:sz="2"/>
-            </w:tcBorders>
-            <w:shd w:fill="FFFFFF" w:color="auto" w:val="clear"/>
-            <w:tcMar>
-              <w:top w:type="dxa" w:w="80"/>
-              <w:left w:type="dxa" w:w="120"/>
-              <w:bottom w:type="dxa" w:w="80"/>
-              <w:right w:type="dxa" w:w="120"/>
-            </w:tcMar>
-            <w:vAlign w:val="center"/>
-          </w:tcPr>
-          <w:p>
-            <w:pPr>
-              <w:widowControl/>
-              <w:spacing w:after="0" w:before="0" w:lineRule="auto"/>
-            </w:pPr>
-            <w:r>
-              <w:rPr>
-                <w:rFonts w:ascii="Calibri" w:cs="Calibri" w:eastAsia="Calibri" w:hAnsi="Calibri"/>
-                <w:b w:val="false"/>
-                <w:bCs w:val="false"/>
-                <w:i w:val="false"/>
-                <w:iCs w:val="false"/>
-                <w:color w:val="000000"/>
-                <w:sz w:val="20"/>
-                <w:szCs w:val="20"/>
-              </w:rPr>
-              <w:t xml:space="preserve">Automatic (daily sync)</w:t>
-            </w:r>
-          </w:p>
-        </w:tc>
-        <w:tc>
-          <w:tcPr>
-            <w:tcW w:type="dxa" w:w="1600"/>
-            <w:tcBorders>
-              <w:top w:val="single" w:color="BFBFBF" w:sz="2"/>
-              <w:left w:val="single" w:color="BFBFBF" w:sz="2"/>
-              <w:bottom w:val="single" w:color="BFBFBF" w:sz="2"/>
-              <w:right w:val="single" w:color="BFBFBF" w:sz="2"/>
-            </w:tcBorders>
-            <w:shd w:fill="FFFFFF" w:color="auto" w:val="clear"/>
-            <w:tcMar>
-              <w:top w:type="dxa" w:w="80"/>
-              <w:left w:type="dxa" w:w="120"/>
-              <w:bottom w:type="dxa" w:w="80"/>
-              <w:right w:type="dxa" w:w="120"/>
-            </w:tcMar>
-            <w:vAlign w:val="center"/>
-          </w:tcPr>
-          <w:p>
-            <w:pPr>
-              <w:widowControl/>
-              <w:spacing w:after="0" w:before="0" w:lineRule="auto"/>
-            </w:pPr>
-            <w:r>
-              <w:rPr>
-                <w:rFonts w:ascii="Calibri" w:cs="Calibri" w:eastAsia="Calibri" w:hAnsi="Calibri"/>
-                <w:b w:val="false"/>
-                <w:bCs w:val="false"/>
-                <w:i w:val="false"/>
-                <w:iCs w:val="false"/>
-                <w:color w:val="000000"/>
-                <w:sz w:val="20"/>
-                <w:szCs w:val="20"/>
-              </w:rPr>
-              <w:t xml:space="preserve">To test</w:t>
+              <w:t xml:space="preserve">✅ Mapped</w:t>
             </w:r>
           </w:p>
         </w:tc>
       </w:tr>
     </w:tbl>
-    <w:p>
-      <w:pPr>
-        <w:spacing w:after="60" w:before="0" w:lineRule="auto"/>
-      </w:pPr>
-    </w:p>
-    <w:p>
-      <w:pPr>
-        <w:keepNext/>
-        <w:keepLines/>
-        <w:widowControl/>
-        <w:spacing w:after="80" w:before="280" w:lineRule="auto"/>
-        <w:outlineLvl w:val="1"/>
-      </w:pPr>
-      <w:r>
-        <w:rPr>
-          <w:rFonts w:ascii="Calibri" w:cs="Calibri" w:eastAsia="Calibri" w:hAnsi="Calibri"/>
-          <w:b/>
-          <w:bCs/>
-          <w:i w:val="false"/>
-          <w:iCs w:val="false"/>
-          <w:color w:val="172F4D"/>
-          <w:sz w:val="24"/>
-          <w:szCs w:val="24"/>
-        </w:rPr>
-        <w:t xml:space="preserve">Writing a good test</w:t>
-      </w:r>
-    </w:p>
-    <w:p>
-      <w:pPr>
-        <w:pStyle w:val="ListParagraph"/>
-        <w:widowControl/>
-        <w:numPr>
-          <w:ilvl w:val="0"/>
-          <w:numId w:val="2"/>
-        </w:numPr>
-        <w:spacing w:after="60" w:before="60" w:lineRule="auto"/>
-        <w:contextualSpacing/>
-      </w:pPr>
-      <w:r>
-        <w:rPr>
-          <w:rFonts w:ascii="Calibri" w:cs="Calibri" w:eastAsia="Calibri" w:hAnsi="Calibri"/>
-          <w:b/>
-          <w:bCs/>
-          <w:i w:val="false"/>
-          <w:iCs w:val="false"/>
-          <w:color w:val="000000"/>
-          <w:sz w:val="20"/>
-          <w:szCs w:val="20"/>
-        </w:rPr>
-        <w:t xml:space="preserve">Precise: </w:t>
-      </w:r>
-      <w:r>
-        <w:rPr>
-          <w:rFonts w:ascii="Calibri" w:cs="Calibri" w:eastAsia="Calibri" w:hAnsi="Calibri"/>
-          <w:b w:val="false"/>
-          <w:bCs w:val="false"/>
-          <w:i w:val="false"/>
-          <w:iCs w:val="false"/>
-          <w:color w:val="000000"/>
-          <w:sz w:val="20"/>
-          <w:szCs w:val="20"/>
-        </w:rPr>
-        <w:t xml:space="preserve">« PHQ-9 score = 27 », not « the score is correct ». One test checks one thing.</w:t>
-      </w:r>
-    </w:p>
-    <w:p>
-      <w:pPr>
-        <w:pStyle w:val="ListParagraph"/>
-        <w:widowControl/>
-        <w:numPr>
-          <w:ilvl w:val="0"/>
-          <w:numId w:val="2"/>
-        </w:numPr>
-        <w:spacing w:after="60" w:before="60" w:lineRule="auto"/>
-        <w:contextualSpacing/>
-      </w:pPr>
-      <w:r>
-        <w:rPr>
-          <w:rFonts w:ascii="Calibri" w:cs="Calibri" w:eastAsia="Calibri" w:hAnsi="Calibri"/>
-          <w:b/>
-          <w:bCs/>
-          <w:i w:val="false"/>
-          <w:iCs w:val="false"/>
-          <w:color w:val="000000"/>
-          <w:sz w:val="20"/>
-          <w:szCs w:val="20"/>
-        </w:rPr>
-        <w:t xml:space="preserve">Negative cases: </w:t>
-      </w:r>
-      <w:r>
-        <w:rPr>
-          <w:rFonts w:ascii="Calibri" w:cs="Calibri" w:eastAsia="Calibri" w:hAnsi="Calibri"/>
-          <w:b w:val="false"/>
-          <w:bCs w:val="false"/>
-          <w:i w:val="false"/>
-          <w:iCs w:val="false"/>
-          <w:color w:val="000000"/>
-          <w:sz w:val="20"/>
-          <w:szCs w:val="20"/>
-        </w:rPr>
-        <w:t xml:space="preserve">Also write what must not happen: « Clinical diagnosis is read-only for the Mental Health Nurse », not « confidentiality works ».</w:t>
-      </w:r>
-    </w:p>
-    <w:p>
-      <w:pPr>
-        <w:pStyle w:val="ListParagraph"/>
-        <w:widowControl/>
-        <w:numPr>
-          <w:ilvl w:val="0"/>
-          <w:numId w:val="2"/>
-        </w:numPr>
-        <w:spacing w:after="60" w:before="60" w:lineRule="auto"/>
-        <w:contextualSpacing/>
-      </w:pPr>
-      <w:r>
-        <w:rPr>
-          <w:rFonts w:ascii="Calibri" w:cs="Calibri" w:eastAsia="Calibri" w:hAnsi="Calibri"/>
-          <w:b/>
-          <w:bCs/>
-          <w:i w:val="false"/>
-          <w:iCs w:val="false"/>
-          <w:color w:val="000000"/>
-          <w:sz w:val="20"/>
-          <w:szCs w:val="20"/>
-        </w:rPr>
-        <w:t xml:space="preserve">Field issues: </w:t>
-      </w:r>
-      <w:r>
-        <w:rPr>
-          <w:rFonts w:ascii="Calibri" w:cs="Calibri" w:eastAsia="Calibri" w:hAnsi="Calibri"/>
-          <w:b w:val="false"/>
-          <w:bCs w:val="false"/>
-          <w:i w:val="false"/>
-          <w:iCs w:val="false"/>
-          <w:color w:val="000000"/>
-          <w:sz w:val="20"/>
-          <w:szCs w:val="20"/>
-        </w:rPr>
-        <w:t xml:space="preserve">A problem seen in the field becomes a test, so it does not come back.</w:t>
-      </w:r>
-    </w:p>
-    <w:p>
-      <w:pPr>
-        <w:pStyle w:val="ListParagraph"/>
-        <w:widowControl/>
-        <w:numPr>
-          <w:ilvl w:val="0"/>
-          <w:numId w:val="2"/>
-        </w:numPr>
-        <w:spacing w:after="60" w:before="60" w:lineRule="auto"/>
-        <w:contextualSpacing/>
-      </w:pPr>
-      <w:r>
-        <w:rPr>
-          <w:rFonts w:ascii="Calibri" w:cs="Calibri" w:eastAsia="Calibri" w:hAnsi="Calibri"/>
-          <w:b/>
-          <w:bCs/>
-          <w:i w:val="false"/>
-          <w:iCs w:val="false"/>
-          <w:color w:val="000000"/>
-          <w:sz w:val="20"/>
-          <w:szCs w:val="20"/>
-        </w:rPr>
-        <w:t xml:space="preserve">Data: </w:t>
-      </w:r>
-      <w:r>
-        <w:rPr>
-          <w:rFonts w:ascii="Calibri" w:cs="Calibri" w:eastAsia="Calibri" w:hAnsi="Calibri"/>
-          <w:b w:val="false"/>
-          <w:bCs w:val="false"/>
-          <w:i w:val="false"/>
-          <w:iCs w:val="false"/>
-          <w:color w:val="000000"/>
-          <w:sz w:val="20"/>
-          <w:szCs w:val="20"/>
-        </w:rPr>
-        <w:t xml:space="preserve">Never use real patient data in a test.</w:t>
-      </w:r>
-    </w:p>
-    <w:p>
-      <w:pPr>
-        <w:keepNext/>
-        <w:keepLines/>
-        <w:widowControl/>
-        <w:spacing w:after="80" w:before="280" w:lineRule="auto"/>
-        <w:outlineLvl w:val="1"/>
-      </w:pPr>
-      <w:r>
-        <w:rPr>
-          <w:rFonts w:ascii="Calibri" w:cs="Calibri" w:eastAsia="Calibri" w:hAnsi="Calibri"/>
-          <w:b/>
-          <w:bCs/>
-          <w:i w:val="false"/>
-          <w:iCs w:val="false"/>
-          <w:color w:val="172F4D"/>
-          <w:sz w:val="24"/>
-          <w:szCs w:val="24"/>
-        </w:rPr>
-        <w:t xml:space="preserve">What would help us most</w:t>
-      </w:r>
-    </w:p>
-    <w:p>
-      <w:pPr>
-        <w:pStyle w:val="ListParagraph"/>
-        <w:widowControl/>
-        <w:numPr>
-          <w:ilvl w:val="0"/>
-          <w:numId w:val="2"/>
-        </w:numPr>
-        <w:spacing w:after="60" w:before="60" w:lineRule="auto"/>
-        <w:contextualSpacing/>
-      </w:pPr>
-      <w:r>
-        <w:rPr>
-          <w:rFonts w:ascii="Calibri" w:cs="Calibri" w:eastAsia="Calibri" w:hAnsi="Calibri"/>
-          <w:b w:val="false"/>
-          <w:bCs w:val="false"/>
-          <w:i w:val="false"/>
-          <w:iCs w:val="false"/>
-          <w:color w:val="000000"/>
-          <w:sz w:val="20"/>
-          <w:szCs w:val="20"/>
-        </w:rPr>
-        <w:t xml:space="preserve">Keep filling the form tabs as today, following the Form Guidance tab.</w:t>
-      </w:r>
-    </w:p>
-    <w:p>
-      <w:pPr>
-        <w:pStyle w:val="ListParagraph"/>
-        <w:widowControl/>
-        <w:numPr>
-          <w:ilvl w:val="0"/>
-          <w:numId w:val="2"/>
-        </w:numPr>
-        <w:spacing w:after="60" w:before="60" w:lineRule="auto"/>
-        <w:contextualSpacing/>
-      </w:pPr>
-      <w:r>
-        <w:rPr>
-          <w:rFonts w:ascii="Calibri" w:cs="Calibri" w:eastAsia="Calibri" w:hAnsi="Calibri"/>
-          <w:b w:val="false"/>
-          <w:bCs w:val="false"/>
-          <w:i w:val="false"/>
-          <w:iCs w:val="false"/>
-          <w:color w:val="000000"/>
-          <w:sz w:val="20"/>
-          <w:szCs w:val="20"/>
-        </w:rPr>
-        <w:t xml:space="preserve">Add tests in the Comments column and the User flow template tab when a rule is not covered by the columns.</w:t>
-      </w:r>
-    </w:p>
-    <w:p>
-      <w:pPr>
-        <w:pStyle w:val="ListParagraph"/>
-        <w:widowControl/>
-        <w:numPr>
-          <w:ilvl w:val="0"/>
-          <w:numId w:val="2"/>
-        </w:numPr>
-        <w:spacing w:after="60" w:before="60" w:lineRule="auto"/>
-        <w:contextualSpacing/>
-      </w:pPr>
-      <w:r>
-        <w:rPr>
-          <w:rFonts w:ascii="Calibri" w:cs="Calibri" w:eastAsia="Calibri" w:hAnsi="Calibri"/>
-          <w:b w:val="false"/>
-          <w:bCs w:val="false"/>
-          <w:i w:val="false"/>
-          <w:iCs w:val="false"/>
-          <w:color w:val="000000"/>
-          <w:sz w:val="20"/>
-          <w:szCs w:val="20"/>
-        </w:rPr>
-        <w:t xml:space="preserve">Tell us your priority areas (for example confidentiality, appointments, DHIS2), and the EMR role matching MedCo, MH manager and Data officer.</w:t>
-      </w:r>
-    </w:p>
     <w:sectPr>
       <w:footerReference w:type="default" r:id="rId7"/>
       <w:pgSz w:w="12240" w:h="15840" w:orient="portrait"/>
@@ -3257,12 +2872,6 @@
       <w:startOverride w:val="1"/>
     </w:lvlOverride>
   </w:num>
-  <w:num w:numId="2">
-    <w:abstractNumId w:val="2"/>
-    <w:lvlOverride w:ilvl="0">
-      <w:startOverride w:val="1"/>
-    </w:lvlOverride>
-  </w:num>
 </w:numbering>
 </file>
 

</xml_diff>